<commit_message>
update files simplified audits
</commit_message>
<xml_diff>
--- a/src/files/fr/general/template-rapport-audit-simplifie.docx
+++ b/src/files/fr/general/template-rapport-audit-simplifie.docx
@@ -1,6 +1,6 @@
 
 <file path=word/document.xml><?xml version="1.0" encoding="utf-8"?>
-<w:document xmlns:wpc="http://schemas.microsoft.com/office/word/2010/wordprocessingCanvas" xmlns:cx="http://schemas.microsoft.com/office/drawing/2014/chartex" xmlns:cx1="http://schemas.microsoft.com/office/drawing/2015/9/8/chartex" xmlns:mc="http://schemas.openxmlformats.org/markup-compatibility/2006" xmlns:o="urn:schemas-microsoft-com:office:office" xmlns:r="http://schemas.openxmlformats.org/officeDocument/2006/relationships" xmlns:m="http://schemas.openxmlformats.org/officeDocument/2006/math" xmlns:v="urn:schemas-microsoft-com:vml" xmlns:wp14="http://schemas.microsoft.com/office/word/2010/wordprocessingDrawing" xmlns:wp="http://schemas.openxmlformats.org/drawingml/2006/wordprocessingDrawing" xmlns:w10="urn:schemas-microsoft-com:office:word" xmlns:w="http://schemas.openxmlformats.org/wordprocessingml/2006/main" xmlns:w14="http://schemas.microsoft.com/office/word/2010/wordml" xmlns:w15="http://schemas.microsoft.com/office/word/2012/wordml" xmlns:w16se="http://schemas.microsoft.com/office/word/2015/wordml/symex" xmlns:wpg="http://schemas.microsoft.com/office/word/2010/wordprocessingGroup" xmlns:wpi="http://schemas.microsoft.com/office/word/2010/wordprocessingInk" xmlns:wne="http://schemas.microsoft.com/office/word/2006/wordml" xmlns:wps="http://schemas.microsoft.com/office/word/2010/wordprocessingShape" mc:Ignorable="w14 w15 w16se wp14">
+<w:document xmlns:wpc="http://schemas.microsoft.com/office/word/2010/wordprocessingCanvas" xmlns:cx="http://schemas.microsoft.com/office/drawing/2014/chartex" xmlns:cx1="http://schemas.microsoft.com/office/drawing/2015/9/8/chartex" xmlns:cx2="http://schemas.microsoft.com/office/drawing/2015/10/21/chartex" xmlns:cx3="http://schemas.microsoft.com/office/drawing/2016/5/9/chartex" xmlns:cx4="http://schemas.microsoft.com/office/drawing/2016/5/10/chartex" xmlns:cx5="http://schemas.microsoft.com/office/drawing/2016/5/11/chartex" xmlns:cx6="http://schemas.microsoft.com/office/drawing/2016/5/12/chartex" xmlns:cx7="http://schemas.microsoft.com/office/drawing/2016/5/13/chartex" xmlns:cx8="http://schemas.microsoft.com/office/drawing/2016/5/14/chartex" xmlns:mc="http://schemas.openxmlformats.org/markup-compatibility/2006" xmlns:aink="http://schemas.microsoft.com/office/drawing/2016/ink" xmlns:am3d="http://schemas.microsoft.com/office/drawing/2017/model3d" xmlns:o="urn:schemas-microsoft-com:office:office" xmlns:oel="http://schemas.microsoft.com/office/2019/extlst" xmlns:r="http://schemas.openxmlformats.org/officeDocument/2006/relationships" xmlns:m="http://schemas.openxmlformats.org/officeDocument/2006/math" xmlns:v="urn:schemas-microsoft-com:vml" xmlns:wp14="http://schemas.microsoft.com/office/word/2010/wordprocessingDrawing" xmlns:wp="http://schemas.openxmlformats.org/drawingml/2006/wordprocessingDrawing" xmlns:w10="urn:schemas-microsoft-com:office:word" xmlns:w="http://schemas.openxmlformats.org/wordprocessingml/2006/main" xmlns:w14="http://schemas.microsoft.com/office/word/2010/wordml" xmlns:w15="http://schemas.microsoft.com/office/word/2012/wordml" xmlns:w16cex="http://schemas.microsoft.com/office/word/2018/wordml/cex" xmlns:w16cid="http://schemas.microsoft.com/office/word/2016/wordml/cid" xmlns:w16="http://schemas.microsoft.com/office/word/2018/wordml" xmlns:w16du="http://schemas.microsoft.com/office/word/2023/wordml/word16du" xmlns:w16sdtdh="http://schemas.microsoft.com/office/word/2020/wordml/sdtdatahash" xmlns:w16sdtfl="http://schemas.microsoft.com/office/word/2024/wordml/sdtformatlock" xmlns:w16se="http://schemas.microsoft.com/office/word/2015/wordml/symex" xmlns:wpg="http://schemas.microsoft.com/office/word/2010/wordprocessingGroup" xmlns:wpi="http://schemas.microsoft.com/office/word/2010/wordprocessingInk" xmlns:wne="http://schemas.microsoft.com/office/word/2006/wordml" xmlns:wps="http://schemas.microsoft.com/office/word/2010/wordprocessingShape" mc:Ignorable="w14 w15 w16se w16cid w16 w16cex w16sdtdh w16sdtfl w16du wp14">
   <w:body>
     <w:p>
       <w:pPr>
@@ -65,22 +65,12 @@
       <w:r>
         <w:t xml:space="preserve">Date de l’évaluation : </w:t>
       </w:r>
-      <w:proofErr w:type="spellStart"/>
       <w:r>
         <w:rPr>
           <w:i/>
         </w:rPr>
-        <w:t>xx.</w:t>
-      </w:r>
-      <w:proofErr w:type="gramStart"/>
-      <w:r>
-        <w:rPr>
-          <w:i/>
-        </w:rPr>
-        <w:t>xx.xxxx</w:t>
-      </w:r>
-      <w:proofErr w:type="spellEnd"/>
-      <w:proofErr w:type="gramEnd"/>
+        <w:t>xx.xx.xxxx</w:t>
+      </w:r>
     </w:p>
     <w:p>
       <w:pPr>
@@ -172,7 +162,19 @@
           <w:rPr>
             <w:rStyle w:val="Hyperlink"/>
           </w:rPr>
-          <w:t>Méthode de contrôle simplifiée de l’accessibilité pour le Luxembourg – v1</w:t>
+          <w:t>Méthode de contrôle simplifiée de l’accessibi</w:t>
+        </w:r>
+        <w:r>
+          <w:rPr>
+            <w:rStyle w:val="Hyperlink"/>
+          </w:rPr>
+          <w:t>l</w:t>
+        </w:r>
+        <w:r>
+          <w:rPr>
+            <w:rStyle w:val="Hyperlink"/>
+          </w:rPr>
+          <w:t>ité pour le Luxembourg – v1</w:t>
         </w:r>
         <w:r>
           <w:rPr>
@@ -194,7 +196,7 @@
           <w:rPr>
             <w:rStyle w:val="Hyperlink"/>
           </w:rPr>
-          <w:t>RGAA v4</w:t>
+          <w:t>RAWeb 1.1</w:t>
         </w:r>
       </w:hyperlink>
     </w:p>
@@ -217,16 +219,11 @@
         <w:spacing w:before="100" w:beforeAutospacing="1" w:after="100" w:afterAutospacing="1"/>
       </w:pPr>
       <w:r>
-        <w:t xml:space="preserve">Attention, l’audit effectué est un audit simplifié et non un audit de conformité (ou audit "complet"). Il a vocation à détecter une série de problèmes d’accessibilité mais n'est pas exhaustif. Le fait qu’aucun problème ne soit remonté pour un critère RGAA donné ne signifie pas qu’il n’y a pas de problème d’accessibilité pour ce critère. De même, lorsque nous rapportons une occurrence d’un problème, ce problème peut avoir d’autres occurrences. N’hésitez pas à vérifier de manière exhaustive l’accessibilité de votre site conformément au référentiel </w:t>
-      </w:r>
-      <w:hyperlink r:id="rId7" w:history="1">
-        <w:r>
-          <w:rPr>
-            <w:rStyle w:val="Hyperlink"/>
-          </w:rPr>
-          <w:t>RGAA v4</w:t>
-        </w:r>
-      </w:hyperlink>
+        <w:t>Attention, l’audit effectué est un audit simplifié et non un audit de conformité (ou audit "complet"). Il a vocation à détecter une série de problèmes d’accessibilité mais n'est pas exhaustif. Le fait qu’aucun problème ne soit remonté pour un critère RGAA donné ne signifie pas qu’il n’y a pas de problème d’accessibilité pour ce critère. De même, lorsque nous rapportons une occurrence d’un problème, ce problème peut avoir d’autres occurrences. N’hésitez pas à vérifier de manière exhaustive l’accessibilité de votre site conformément au référentie</w:t>
+      </w:r>
+      <w:r>
+        <w:t>l RAWeb 1.1</w:t>
+      </w:r>
       <w:r>
         <w:t xml:space="preserve">. </w:t>
       </w:r>
@@ -284,15 +281,7 @@
         <w:spacing w:before="100" w:beforeAutospacing="1" w:after="100" w:afterAutospacing="1"/>
       </w:pPr>
       <w:r>
-        <w:t>(</w:t>
-      </w:r>
-      <w:proofErr w:type="gramStart"/>
-      <w:r>
-        <w:t>échelle</w:t>
-      </w:r>
-      <w:proofErr w:type="gramEnd"/>
-      <w:r>
-        <w:t> : très faible, faible, moyen, bon, très bon)</w:t>
+        <w:t>(échelle : très faible, faible, moyen, bon, très bon)</w:t>
       </w:r>
     </w:p>
     <w:p>
@@ -302,14 +291,12 @@
           <w:i/>
         </w:rPr>
       </w:pPr>
-      <w:proofErr w:type="gramStart"/>
       <w:r>
         <w:rPr>
           <w:i/>
         </w:rPr>
         <w:t>résumé</w:t>
       </w:r>
-      <w:proofErr w:type="gramEnd"/>
     </w:p>
     <w:p>
       <w:r>
@@ -478,102 +465,84 @@
         </w:rPr>
         <w:t xml:space="preserve">Donner à chaque </w:t>
       </w:r>
-      <w:hyperlink r:id="rId8" w:anchor="image-porteuse-d-information" w:history="1">
-        <w:r>
-          <w:rPr>
-            <w:rStyle w:val="Hyperlink"/>
-            <w:rFonts w:ascii="Times New Roman" w:eastAsia="Times New Roman" w:hAnsi="Times New Roman" w:cs="Times New Roman"/>
-            <w:kern w:val="0"/>
-            <w:szCs w:val="24"/>
-          </w:rPr>
-          <w:t>image porteuse d’information</w:t>
-        </w:r>
-      </w:hyperlink>
+      <w:r>
+        <w:rPr>
+          <w:rFonts w:ascii="Times New Roman" w:eastAsia="Times New Roman" w:hAnsi="Times New Roman" w:cs="Times New Roman"/>
+          <w:kern w:val="0"/>
+          <w:szCs w:val="24"/>
+        </w:rPr>
+        <w:t>image porteuse d’information</w:t>
+      </w:r>
       <w:r>
         <w:rPr>
           <w:rFonts w:ascii="Calibri" w:hAnsi="Calibri" w:cs="Calibri"/>
         </w:rPr>
         <w:t xml:space="preserve"> une </w:t>
       </w:r>
-      <w:hyperlink r:id="rId9" w:anchor="alternative-textuelle-image" w:history="1">
-        <w:r>
-          <w:rPr>
-            <w:rStyle w:val="Hyperlink"/>
-            <w:rFonts w:ascii="Times New Roman" w:eastAsia="Times New Roman" w:hAnsi="Times New Roman" w:cs="Times New Roman"/>
-            <w:kern w:val="0"/>
-            <w:szCs w:val="24"/>
-          </w:rPr>
-          <w:t>alternative textuelle</w:t>
-        </w:r>
-      </w:hyperlink>
+      <w:r>
+        <w:rPr>
+          <w:rFonts w:ascii="Times New Roman" w:eastAsia="Times New Roman" w:hAnsi="Times New Roman" w:cs="Times New Roman"/>
+          <w:kern w:val="0"/>
+          <w:szCs w:val="24"/>
+        </w:rPr>
+        <w:t>alternative textuelle</w:t>
+      </w:r>
       <w:r>
         <w:rPr>
           <w:rFonts w:ascii="Calibri" w:hAnsi="Calibri" w:cs="Calibri"/>
         </w:rPr>
         <w:t xml:space="preserve"> pertinente et une </w:t>
       </w:r>
-      <w:hyperlink r:id="rId10" w:anchor="description-detaillee-image" w:history="1">
-        <w:r>
-          <w:rPr>
-            <w:rStyle w:val="Hyperlink"/>
-            <w:rFonts w:ascii="Times New Roman" w:eastAsia="Times New Roman" w:hAnsi="Times New Roman" w:cs="Times New Roman"/>
-            <w:kern w:val="0"/>
-            <w:szCs w:val="24"/>
-          </w:rPr>
-          <w:t>description détaillée</w:t>
-        </w:r>
-      </w:hyperlink>
+      <w:r>
+        <w:rPr>
+          <w:rFonts w:ascii="Times New Roman" w:eastAsia="Times New Roman" w:hAnsi="Times New Roman" w:cs="Times New Roman"/>
+          <w:kern w:val="0"/>
+          <w:szCs w:val="24"/>
+        </w:rPr>
+        <w:t>description détaillée</w:t>
+      </w:r>
       <w:r>
         <w:rPr>
           <w:rFonts w:ascii="Calibri" w:hAnsi="Calibri" w:cs="Calibri"/>
         </w:rPr>
         <w:t xml:space="preserve"> si nécessaire. Lier les </w:t>
       </w:r>
-      <w:hyperlink r:id="rId11" w:anchor="legende-d-image" w:history="1">
-        <w:r>
-          <w:rPr>
-            <w:rStyle w:val="Hyperlink"/>
-            <w:rFonts w:ascii="Times New Roman" w:eastAsia="Times New Roman" w:hAnsi="Times New Roman" w:cs="Times New Roman"/>
-            <w:kern w:val="0"/>
-            <w:szCs w:val="24"/>
-          </w:rPr>
-          <w:t>légendes</w:t>
-        </w:r>
-      </w:hyperlink>
+      <w:r>
+        <w:rPr>
+          <w:rFonts w:ascii="Times New Roman" w:eastAsia="Times New Roman" w:hAnsi="Times New Roman" w:cs="Times New Roman"/>
+          <w:kern w:val="0"/>
+          <w:szCs w:val="24"/>
+        </w:rPr>
+        <w:t>légendes</w:t>
+      </w:r>
       <w:r>
         <w:rPr>
           <w:rFonts w:ascii="Calibri" w:hAnsi="Calibri" w:cs="Calibri"/>
         </w:rPr>
         <w:t xml:space="preserve"> à leurs images. Remplacer les </w:t>
       </w:r>
-      <w:hyperlink r:id="rId12" w:anchor="image-texte" w:history="1">
-        <w:r>
-          <w:rPr>
-            <w:rStyle w:val="Hyperlink"/>
-            <w:rFonts w:ascii="Times New Roman" w:eastAsia="Times New Roman" w:hAnsi="Times New Roman" w:cs="Times New Roman"/>
-            <w:kern w:val="0"/>
-            <w:szCs w:val="24"/>
-          </w:rPr>
-          <w:t>images textes</w:t>
-        </w:r>
-      </w:hyperlink>
+      <w:r>
+        <w:rPr>
+          <w:rFonts w:ascii="Times New Roman" w:eastAsia="Times New Roman" w:hAnsi="Times New Roman" w:cs="Times New Roman"/>
+          <w:kern w:val="0"/>
+          <w:szCs w:val="24"/>
+        </w:rPr>
+        <w:t>images textes</w:t>
+      </w:r>
       <w:r>
         <w:rPr>
           <w:rFonts w:ascii="Calibri" w:hAnsi="Calibri" w:cs="Calibri"/>
         </w:rPr>
         <w:t xml:space="preserve"> par du </w:t>
       </w:r>
-      <w:hyperlink r:id="rId13" w:anchor="texte-style" w:history="1">
-        <w:r>
-          <w:rPr>
-            <w:rStyle w:val="Hyperlink"/>
-            <w:rFonts w:ascii="Times New Roman" w:eastAsia="Times New Roman" w:hAnsi="Times New Roman" w:cs="Times New Roman"/>
-            <w:kern w:val="0"/>
-            <w:szCs w:val="24"/>
-          </w:rPr>
-          <w:t>texte stylé</w:t>
-        </w:r>
-      </w:hyperlink>
+      <w:r>
+        <w:rPr>
+          <w:rFonts w:ascii="Times New Roman" w:eastAsia="Times New Roman" w:hAnsi="Times New Roman" w:cs="Times New Roman"/>
+          <w:kern w:val="0"/>
+          <w:szCs w:val="24"/>
+        </w:rPr>
+        <w:t>texte stylé</w:t>
+      </w:r>
       <w:r>
         <w:rPr>
           <w:rFonts w:ascii="Calibri" w:hAnsi="Calibri" w:cs="Calibri"/>
@@ -612,15 +581,7 @@
         <w:divId w:val="1256523850"/>
       </w:pPr>
       <w:r>
-        <w:t xml:space="preserve">Description du problème rencontré sur le site avec proposition de solution + </w:t>
-      </w:r>
-      <w:proofErr w:type="spellStart"/>
-      <w:r>
-        <w:t>screenshot</w:t>
-      </w:r>
-      <w:proofErr w:type="spellEnd"/>
-      <w:r>
-        <w:t xml:space="preserve"> si possible.</w:t>
+        <w:t>Description du problème rencontré sur le site avec proposition de solution + screenshot si possible.</w:t>
       </w:r>
     </w:p>
     <w:p>
@@ -657,39 +618,24 @@
         </w:rPr>
         <w:t xml:space="preserve">Donner à chaque </w:t>
       </w:r>
-      <w:hyperlink r:id="rId14" w:anchor="cadre" w:history="1">
-        <w:r>
-          <w:rPr>
-            <w:rStyle w:val="Hyperlink"/>
-            <w:rFonts w:asciiTheme="minorHAnsi" w:hAnsiTheme="minorHAnsi" w:cstheme="minorHAnsi"/>
-          </w:rPr>
-          <w:t>ca</w:t>
-        </w:r>
-        <w:bookmarkStart w:id="2" w:name="_GoBack"/>
-        <w:bookmarkEnd w:id="2"/>
-        <w:r>
-          <w:rPr>
-            <w:rStyle w:val="Hyperlink"/>
-            <w:rFonts w:asciiTheme="minorHAnsi" w:hAnsiTheme="minorHAnsi" w:cstheme="minorHAnsi"/>
-          </w:rPr>
-          <w:t>dre</w:t>
-        </w:r>
-      </w:hyperlink>
+      <w:r>
+        <w:rPr>
+          <w:rFonts w:asciiTheme="minorHAnsi" w:hAnsiTheme="minorHAnsi" w:cstheme="minorHAnsi"/>
+        </w:rPr>
+        <w:t>cadre</w:t>
+      </w:r>
       <w:r>
         <w:rPr>
           <w:rFonts w:asciiTheme="minorHAnsi" w:hAnsiTheme="minorHAnsi" w:cstheme="minorHAnsi"/>
         </w:rPr>
         <w:t xml:space="preserve"> un </w:t>
       </w:r>
-      <w:hyperlink r:id="rId15" w:anchor="titre-de-cadre" w:history="1">
-        <w:r>
-          <w:rPr>
-            <w:rStyle w:val="Hyperlink"/>
-            <w:rFonts w:asciiTheme="minorHAnsi" w:hAnsiTheme="minorHAnsi" w:cstheme="minorHAnsi"/>
-          </w:rPr>
-          <w:t>titre</w:t>
-        </w:r>
-      </w:hyperlink>
+      <w:r>
+        <w:rPr>
+          <w:rFonts w:asciiTheme="minorHAnsi" w:hAnsiTheme="minorHAnsi" w:cstheme="minorHAnsi"/>
+        </w:rPr>
+        <w:t>titre</w:t>
+      </w:r>
       <w:r>
         <w:rPr>
           <w:rFonts w:asciiTheme="minorHAnsi" w:hAnsiTheme="minorHAnsi" w:cstheme="minorHAnsi"/>
@@ -716,16 +662,16 @@
         <w:pStyle w:val="Heading2"/>
         <w:divId w:val="1256523850"/>
       </w:pPr>
-      <w:bookmarkStart w:id="3" w:name="_Toc383062578"/>
-      <w:bookmarkStart w:id="4" w:name="__RefHeading__948_1454273984"/>
+      <w:bookmarkStart w:id="2" w:name="_Toc383062578"/>
+      <w:bookmarkStart w:id="3" w:name="__RefHeading__948_1454273984"/>
       <w:r>
         <w:t>C</w:t>
       </w:r>
+      <w:bookmarkEnd w:id="2"/>
+      <w:r>
+        <w:t>ouleurs</w:t>
+      </w:r>
       <w:bookmarkEnd w:id="3"/>
-      <w:r>
-        <w:t>ouleurs</w:t>
-      </w:r>
-      <w:bookmarkEnd w:id="4"/>
     </w:p>
     <w:p>
       <w:pPr>
@@ -738,51 +684,42 @@
         </w:rPr>
         <w:t>Ne pas donner l’</w:t>
       </w:r>
-      <w:hyperlink r:id="rId16" w:anchor="information-donnee-par-la-couleur" w:history="1">
-        <w:r>
-          <w:rPr>
-            <w:rStyle w:val="Hyperlink"/>
-            <w:rFonts w:ascii="Times New Roman" w:eastAsia="Times New Roman" w:hAnsi="Times New Roman" w:cs="Times New Roman"/>
-            <w:kern w:val="0"/>
-            <w:szCs w:val="24"/>
-          </w:rPr>
-          <w:t>information</w:t>
-        </w:r>
-      </w:hyperlink>
+      <w:r>
+        <w:rPr>
+          <w:rFonts w:ascii="Times New Roman" w:eastAsia="Times New Roman" w:hAnsi="Times New Roman" w:cs="Times New Roman"/>
+          <w:kern w:val="0"/>
+          <w:szCs w:val="24"/>
+        </w:rPr>
+        <w:t>information</w:t>
+      </w:r>
       <w:r>
         <w:rPr>
           <w:rFonts w:ascii="Calibri" w:hAnsi="Calibri" w:cs="Calibri"/>
         </w:rPr>
         <w:t xml:space="preserve"> uniquement par la couleur et utiliser des </w:t>
       </w:r>
-      <w:hyperlink r:id="rId17" w:anchor="contraste" w:history="1">
-        <w:r>
-          <w:rPr>
-            <w:rStyle w:val="Hyperlink"/>
-            <w:rFonts w:ascii="Times New Roman" w:eastAsia="Times New Roman" w:hAnsi="Times New Roman" w:cs="Times New Roman"/>
-            <w:kern w:val="0"/>
-            <w:szCs w:val="24"/>
-          </w:rPr>
-          <w:t>contrastes</w:t>
-        </w:r>
-      </w:hyperlink>
+      <w:r>
+        <w:rPr>
+          <w:rFonts w:ascii="Times New Roman" w:eastAsia="Times New Roman" w:hAnsi="Times New Roman" w:cs="Times New Roman"/>
+          <w:kern w:val="0"/>
+          <w:szCs w:val="24"/>
+        </w:rPr>
+        <w:t>contrastes</w:t>
+      </w:r>
       <w:r>
         <w:rPr>
           <w:rFonts w:ascii="Calibri" w:hAnsi="Calibri" w:cs="Calibri"/>
         </w:rPr>
         <w:t xml:space="preserve"> de couleurs suffisamment élevés pour les textes, les </w:t>
       </w:r>
-      <w:hyperlink r:id="rId18" w:anchor="composant-d-interface" w:history="1">
-        <w:r>
-          <w:rPr>
-            <w:rStyle w:val="Hyperlink"/>
-            <w:rFonts w:ascii="Times New Roman" w:eastAsia="Times New Roman" w:hAnsi="Times New Roman" w:cs="Times New Roman"/>
-            <w:kern w:val="0"/>
-            <w:szCs w:val="24"/>
-          </w:rPr>
-          <w:t>composants d’interface</w:t>
-        </w:r>
-      </w:hyperlink>
+      <w:r>
+        <w:rPr>
+          <w:rFonts w:ascii="Times New Roman" w:eastAsia="Times New Roman" w:hAnsi="Times New Roman" w:cs="Times New Roman"/>
+          <w:kern w:val="0"/>
+          <w:szCs w:val="24"/>
+        </w:rPr>
+        <w:t>composants d’interface</w:t>
+      </w:r>
       <w:r>
         <w:rPr>
           <w:rFonts w:ascii="Calibri" w:hAnsi="Calibri" w:cs="Calibri"/>
@@ -794,7 +731,7 @@
       <w:pPr>
         <w:divId w:val="1256523850"/>
       </w:pPr>
-      <w:bookmarkStart w:id="5" w:name="__RefHeading__973_1268055327"/>
+      <w:bookmarkStart w:id="4" w:name="__RefHeading__973_1268055327"/>
       <w:r>
         <w:t>...</w:t>
       </w:r>
@@ -807,7 +744,7 @@
       <w:r>
         <w:t>Multimédia</w:t>
       </w:r>
-      <w:bookmarkEnd w:id="5"/>
+      <w:bookmarkEnd w:id="4"/>
     </w:p>
     <w:p>
       <w:pPr>
@@ -820,95 +757,64 @@
         </w:rPr>
         <w:t xml:space="preserve">Donner à chaque </w:t>
       </w:r>
-      <w:hyperlink r:id="rId19" w:anchor="media-temporel-type-son-video-et-synchronise" w:history="1">
-        <w:r>
-          <w:rPr>
-            <w:rStyle w:val="Hyperlink"/>
-            <w:rFonts w:ascii="Times New Roman" w:eastAsia="Times New Roman" w:hAnsi="Times New Roman" w:cs="Times New Roman"/>
-            <w:kern w:val="0"/>
-            <w:szCs w:val="24"/>
-          </w:rPr>
-          <w:t>média temporel</w:t>
-        </w:r>
-      </w:hyperlink>
+      <w:r>
+        <w:rPr>
+          <w:rFonts w:ascii="Times New Roman" w:eastAsia="Times New Roman" w:hAnsi="Times New Roman" w:cs="Times New Roman"/>
+          <w:kern w:val="0"/>
+          <w:szCs w:val="24"/>
+        </w:rPr>
+        <w:t>média temporel</w:t>
+      </w:r>
       <w:r>
         <w:rPr>
           <w:rFonts w:ascii="Calibri" w:hAnsi="Calibri" w:cs="Calibri"/>
         </w:rPr>
         <w:t xml:space="preserve"> audio et/ou vidéo une </w:t>
       </w:r>
-      <w:hyperlink r:id="rId20" w:anchor="transcription-textuelle-media-temporel" w:history="1">
-        <w:r>
-          <w:rPr>
-            <w:rStyle w:val="Hyperlink"/>
-            <w:rFonts w:ascii="Times New Roman" w:eastAsia="Times New Roman" w:hAnsi="Times New Roman" w:cs="Times New Roman"/>
-            <w:kern w:val="0"/>
-            <w:szCs w:val="24"/>
-          </w:rPr>
-          <w:t>transcription textuelle</w:t>
-        </w:r>
-      </w:hyperlink>
+      <w:r>
+        <w:rPr>
+          <w:rFonts w:ascii="Times New Roman" w:eastAsia="Times New Roman" w:hAnsi="Times New Roman" w:cs="Times New Roman"/>
+          <w:kern w:val="0"/>
+          <w:szCs w:val="24"/>
+        </w:rPr>
+        <w:t>transcription textuelle</w:t>
+      </w:r>
       <w:r>
         <w:rPr>
           <w:rFonts w:ascii="Calibri" w:hAnsi="Calibri" w:cs="Calibri"/>
         </w:rPr>
         <w:t xml:space="preserve">, des </w:t>
       </w:r>
-      <w:hyperlink r:id="rId21" w:anchor="sous-titres-synchronises-objet-multimedia" w:history="1">
-        <w:r>
-          <w:rPr>
-            <w:rStyle w:val="Hyperlink"/>
-            <w:rFonts w:ascii="Times New Roman" w:eastAsia="Times New Roman" w:hAnsi="Times New Roman" w:cs="Times New Roman"/>
-            <w:kern w:val="0"/>
-            <w:szCs w:val="24"/>
-          </w:rPr>
-          <w:t>sous-titres</w:t>
-        </w:r>
-      </w:hyperlink>
+      <w:r>
+        <w:rPr>
+          <w:rFonts w:ascii="Times New Roman" w:eastAsia="Times New Roman" w:hAnsi="Times New Roman" w:cs="Times New Roman"/>
+          <w:kern w:val="0"/>
+          <w:szCs w:val="24"/>
+        </w:rPr>
+        <w:t>sous-titres</w:t>
+      </w:r>
       <w:r>
         <w:rPr>
           <w:rFonts w:ascii="Calibri" w:hAnsi="Calibri" w:cs="Calibri"/>
         </w:rPr>
         <w:t xml:space="preserve"> ou une </w:t>
       </w:r>
-      <w:hyperlink r:id="rId22" w:anchor="audiodescription-synchronisee-media-temporel" w:history="1">
-        <w:proofErr w:type="spellStart"/>
-        <w:r>
-          <w:rPr>
-            <w:rStyle w:val="Hyperlink"/>
-            <w:rFonts w:ascii="Times New Roman" w:eastAsia="Times New Roman" w:hAnsi="Times New Roman" w:cs="Times New Roman"/>
-            <w:kern w:val="0"/>
-            <w:szCs w:val="24"/>
-          </w:rPr>
-          <w:t>audio-description</w:t>
-        </w:r>
-        <w:proofErr w:type="spellEnd"/>
-      </w:hyperlink>
+      <w:r>
+        <w:rPr>
+          <w:rFonts w:ascii="Times New Roman" w:eastAsia="Times New Roman" w:hAnsi="Times New Roman" w:cs="Times New Roman"/>
+          <w:kern w:val="0"/>
+          <w:szCs w:val="24"/>
+        </w:rPr>
+        <w:t>audio-description</w:t>
+      </w:r>
       <w:r>
         <w:rPr>
           <w:rFonts w:ascii="Calibri" w:hAnsi="Calibri" w:cs="Calibri"/>
         </w:rPr>
         <w:t xml:space="preserve"> pertinents lorsque cela est nécessaire. Donner à chaque contenu graphique ou interactif (ou </w:t>
       </w:r>
-      <w:hyperlink r:id="rId23" w:anchor="media-non-temporel" w:history="1">
-        <w:r>
-          <w:rPr>
-            <w:rStyle w:val="Hyperlink"/>
-            <w:rFonts w:ascii="Times New Roman" w:eastAsia="Times New Roman" w:hAnsi="Times New Roman" w:cs="Times New Roman"/>
-            <w:kern w:val="0"/>
-            <w:szCs w:val="24"/>
-          </w:rPr>
-          <w:t xml:space="preserve">média non </w:t>
-        </w:r>
-      </w:hyperlink>
-      <w:r>
-        <w:rPr>
-          <w:rStyle w:val="Hyperlink"/>
-          <w:rFonts w:ascii="Times New Roman" w:eastAsia="Times New Roman" w:hAnsi="Times New Roman" w:cs="Times New Roman"/>
-          <w:kern w:val="0"/>
-          <w:szCs w:val="24"/>
-        </w:rPr>
-        <w:t>temporel</w:t>
+      <w:r>
+        <w:t>média non temporel</w:t>
       </w:r>
       <w:r>
         <w:rPr>
@@ -916,66 +822,40 @@
         </w:rPr>
         <w:t xml:space="preserve">) une alternative textuelle pertinente. Rendre possible le </w:t>
       </w:r>
-      <w:hyperlink r:id="rId24" w:anchor="controle-de-la-consultation-d-un-media-temporel" w:history="1">
-        <w:r>
-          <w:rPr>
-            <w:rStyle w:val="Hyperlink"/>
-            <w:rFonts w:ascii="Times New Roman" w:eastAsia="Times New Roman" w:hAnsi="Times New Roman" w:cs="Times New Roman"/>
-            <w:kern w:val="0"/>
-            <w:szCs w:val="24"/>
-          </w:rPr>
-          <w:t>contrôle de l</w:t>
-        </w:r>
-      </w:hyperlink>
-      <w:hyperlink r:id="rId25" w:anchor="controle-de-la-consultation-d-un-media-temporel" w:history="1">
-        <w:r>
-          <w:rPr>
-            <w:rStyle w:val="Hyperlink"/>
-            <w:rFonts w:ascii="Times New Roman" w:eastAsia="Times New Roman" w:hAnsi="Times New Roman" w:cs="Times New Roman"/>
-            <w:kern w:val="0"/>
-            <w:szCs w:val="24"/>
-          </w:rPr>
-          <w:t>eur</w:t>
-        </w:r>
-      </w:hyperlink>
-      <w:hyperlink r:id="rId26" w:anchor="controle-de-la-consultation-d-un-media-temporel" w:history="1">
-        <w:r>
-          <w:rPr>
-            <w:rStyle w:val="Hyperlink"/>
-            <w:rFonts w:ascii="Times New Roman" w:eastAsia="Times New Roman" w:hAnsi="Times New Roman" w:cs="Times New Roman"/>
-            <w:kern w:val="0"/>
-            <w:szCs w:val="24"/>
-          </w:rPr>
-          <w:t xml:space="preserve"> consultation</w:t>
-        </w:r>
-      </w:hyperlink>
-      <w:r>
-        <w:rPr>
-          <w:rFonts w:ascii="Calibri" w:hAnsi="Calibri" w:cs="Calibri"/>
-        </w:rPr>
-        <w:t xml:space="preserve"> et leur </w:t>
-      </w:r>
-      <w:r>
-        <w:rPr>
-          <w:rStyle w:val="Hyperlink"/>
-          <w:rFonts w:ascii="Times New Roman" w:eastAsia="Times New Roman" w:hAnsi="Times New Roman" w:cs="Times New Roman"/>
-          <w:kern w:val="0"/>
-          <w:szCs w:val="24"/>
-        </w:rPr>
+      <w:r>
+        <w:rPr>
+          <w:rFonts w:ascii="Times New Roman" w:eastAsia="Times New Roman" w:hAnsi="Times New Roman" w:cs="Times New Roman"/>
+          <w:kern w:val="0"/>
+          <w:szCs w:val="24"/>
+        </w:rPr>
+        <w:t>contrôle de leur consultation</w:t>
+      </w:r>
+      <w:r>
+        <w:rPr>
+          <w:rFonts w:ascii="Calibri" w:hAnsi="Calibri" w:cs="Calibri"/>
+        </w:rPr>
+        <w:t xml:space="preserve"> et </w:t>
+      </w:r>
+      <w:r>
+        <w:rPr>
+          <w:rFonts w:ascii="Times New Roman" w:eastAsia="Times New Roman" w:hAnsi="Times New Roman" w:cs="Times New Roman"/>
+          <w:kern w:val="0"/>
+          <w:szCs w:val="24"/>
+        </w:rPr>
+        <w:t xml:space="preserve">leur </w:t>
+      </w:r>
+      <w:r>
         <w:t xml:space="preserve">manipulation </w:t>
       </w:r>
-      <w:hyperlink r:id="rId27" w:anchor="accessible-et-activable-par-le-clavier-et-tout-dispositif-de-pointage" w:history="1">
-        <w:r>
-          <w:rPr>
-            <w:rStyle w:val="Hyperlink"/>
-            <w:rFonts w:ascii="Times New Roman" w:eastAsia="Times New Roman" w:hAnsi="Times New Roman" w:cs="Times New Roman"/>
-            <w:kern w:val="0"/>
-            <w:szCs w:val="24"/>
-          </w:rPr>
-          <w:t>au clavier</w:t>
-        </w:r>
-      </w:hyperlink>
-      <w:hyperlink r:id="rId28" w:anchor="accessible-et-activable-par-le-clavier-et-tout-dispositif-de-pointage" w:history="1">
+      <w:r>
+        <w:rPr>
+          <w:rFonts w:ascii="Times New Roman" w:eastAsia="Times New Roman" w:hAnsi="Times New Roman" w:cs="Times New Roman"/>
+          <w:kern w:val="0"/>
+          <w:szCs w:val="24"/>
+        </w:rPr>
+        <w:t>au clavier</w:t>
+      </w:r>
+      <w:hyperlink r:id="rId7" w:anchor="accessible-et-activable-par-le-clavier-et-tout-dispositif-de-pointage" w:history="1">
         <w:r>
           <w:rPr>
             <w:rStyle w:val="Hyperlink"/>
@@ -986,45 +866,28 @@
           <w:t xml:space="preserve"> </w:t>
         </w:r>
       </w:hyperlink>
-      <w:hyperlink r:id="rId29" w:anchor="accessible-et-activable-par-le-clavier-et-tout-dispositif-de-pointage" w:history="1">
-        <w:r>
-          <w:rPr>
-            <w:rStyle w:val="Hyperlink"/>
-            <w:rFonts w:ascii="Times New Roman" w:eastAsia="Times New Roman" w:hAnsi="Times New Roman" w:cs="Times New Roman"/>
-            <w:kern w:val="0"/>
-            <w:szCs w:val="24"/>
-          </w:rPr>
-          <w:t>et avec tout dispos</w:t>
-        </w:r>
-      </w:hyperlink>
-      <w:hyperlink r:id="rId30" w:anchor="accessible-et-activable-par-le-clavier-et-tout-dispositif-de-pointage" w:history="1">
-        <w:r>
-          <w:rPr>
-            <w:rStyle w:val="Hyperlink"/>
-            <w:rFonts w:ascii="Times New Roman" w:eastAsia="Times New Roman" w:hAnsi="Times New Roman" w:cs="Times New Roman"/>
-            <w:kern w:val="0"/>
-            <w:szCs w:val="24"/>
-          </w:rPr>
-          <w:t>itif de pointage</w:t>
-        </w:r>
-      </w:hyperlink>
+      <w:r>
+        <w:rPr>
+          <w:rFonts w:ascii="Times New Roman" w:eastAsia="Times New Roman" w:hAnsi="Times New Roman" w:cs="Times New Roman"/>
+          <w:kern w:val="0"/>
+          <w:szCs w:val="24"/>
+        </w:rPr>
+        <w:t>et avec tout dispositif de pointage</w:t>
+      </w:r>
       <w:r>
         <w:rPr>
           <w:rFonts w:ascii="Calibri" w:hAnsi="Calibri" w:cs="Calibri"/>
         </w:rPr>
         <w:t xml:space="preserve"> comme la souris. S’assurer de leur </w:t>
       </w:r>
-      <w:hyperlink r:id="rId31" w:anchor="compatible-avec-les-technologies-d-assistance" w:history="1">
-        <w:r>
-          <w:rPr>
-            <w:rStyle w:val="Hyperlink"/>
-            <w:rFonts w:ascii="Times New Roman" w:eastAsia="Times New Roman" w:hAnsi="Times New Roman" w:cs="Times New Roman"/>
-            <w:kern w:val="0"/>
-            <w:szCs w:val="24"/>
-          </w:rPr>
-          <w:t>compatibilité avec les technologies d’assistance</w:t>
-        </w:r>
-      </w:hyperlink>
+      <w:r>
+        <w:rPr>
+          <w:rFonts w:ascii="Times New Roman" w:eastAsia="Times New Roman" w:hAnsi="Times New Roman" w:cs="Times New Roman"/>
+          <w:kern w:val="0"/>
+          <w:szCs w:val="24"/>
+        </w:rPr>
+        <w:t>compatibilité avec les technologies d’assistance</w:t>
+      </w:r>
       <w:r>
         <w:rPr>
           <w:rFonts w:ascii="Calibri" w:hAnsi="Calibri" w:cs="Calibri"/>
@@ -1036,7 +899,7 @@
       <w:pPr>
         <w:divId w:val="1256523850"/>
       </w:pPr>
-      <w:bookmarkStart w:id="6" w:name="__RefHeading__975_1268055327"/>
+      <w:bookmarkStart w:id="5" w:name="__RefHeading__975_1268055327"/>
       <w:r>
         <w:t>...</w:t>
       </w:r>
@@ -1049,109 +912,91 @@
       <w:r>
         <w:t>Tableaux</w:t>
       </w:r>
-      <w:bookmarkEnd w:id="6"/>
+      <w:bookmarkEnd w:id="5"/>
     </w:p>
     <w:p>
       <w:pPr>
         <w:pStyle w:val="introductioncritre"/>
         <w:divId w:val="1256523850"/>
       </w:pPr>
-      <w:hyperlink r:id="rId32" w:anchor="passage-de-texte-associe-au-tableau-de-donnees" w:history="1">
-        <w:r>
-          <w:rPr>
-            <w:rStyle w:val="Hyperlink"/>
-            <w:rFonts w:ascii="Times New Roman" w:eastAsia="Times New Roman" w:hAnsi="Times New Roman" w:cs="Times New Roman"/>
-            <w:kern w:val="0"/>
-            <w:szCs w:val="24"/>
-          </w:rPr>
-          <w:t>Associer</w:t>
-        </w:r>
-      </w:hyperlink>
+      <w:r>
+        <w:rPr>
+          <w:rFonts w:ascii="Times New Roman" w:eastAsia="Times New Roman" w:hAnsi="Times New Roman" w:cs="Times New Roman"/>
+          <w:kern w:val="0"/>
+          <w:szCs w:val="24"/>
+        </w:rPr>
+        <w:t>Associer</w:t>
+      </w:r>
       <w:r>
         <w:rPr>
           <w:rFonts w:ascii="Calibri" w:hAnsi="Calibri" w:cs="Calibri"/>
         </w:rPr>
         <w:t xml:space="preserve"> correctement les </w:t>
       </w:r>
-      <w:hyperlink r:id="rId33" w:anchor="tableau-de-donnees-ayant-un-titre" w:history="1">
-        <w:r>
-          <w:rPr>
-            <w:rStyle w:val="Hyperlink"/>
-            <w:rFonts w:ascii="Times New Roman" w:eastAsia="Times New Roman" w:hAnsi="Times New Roman" w:cs="Times New Roman"/>
-            <w:kern w:val="0"/>
-            <w:szCs w:val="24"/>
-          </w:rPr>
-          <w:t>tableaux de données à leur titre</w:t>
-        </w:r>
-      </w:hyperlink>
+      <w:r>
+        <w:rPr>
+          <w:rFonts w:ascii="Times New Roman" w:eastAsia="Times New Roman" w:hAnsi="Times New Roman" w:cs="Times New Roman"/>
+          <w:kern w:val="0"/>
+          <w:szCs w:val="24"/>
+        </w:rPr>
+        <w:t>tableaux de données à leur titre</w:t>
+      </w:r>
       <w:r>
         <w:rPr>
           <w:rFonts w:ascii="Calibri" w:hAnsi="Calibri" w:cs="Calibri"/>
         </w:rPr>
         <w:t xml:space="preserve">, donner à chaque </w:t>
       </w:r>
-      <w:hyperlink r:id="rId34" w:anchor="tableau-de-donnees-complexe" w:history="1">
-        <w:r>
-          <w:rPr>
-            <w:rStyle w:val="Hyperlink"/>
-            <w:rFonts w:ascii="Times New Roman" w:eastAsia="Times New Roman" w:hAnsi="Times New Roman" w:cs="Times New Roman"/>
-            <w:kern w:val="0"/>
-            <w:szCs w:val="24"/>
-          </w:rPr>
-          <w:t>tableau de données complexe</w:t>
-        </w:r>
-      </w:hyperlink>
+      <w:r>
+        <w:rPr>
+          <w:rFonts w:ascii="Times New Roman" w:eastAsia="Times New Roman" w:hAnsi="Times New Roman" w:cs="Times New Roman"/>
+          <w:kern w:val="0"/>
+          <w:szCs w:val="24"/>
+        </w:rPr>
+        <w:t>tableau de données complexe</w:t>
+      </w:r>
       <w:r>
         <w:rPr>
           <w:rFonts w:ascii="Calibri" w:hAnsi="Calibri" w:cs="Calibri"/>
         </w:rPr>
         <w:t xml:space="preserve">, un </w:t>
       </w:r>
-      <w:hyperlink r:id="rId35" w:anchor="resume" w:history="1">
-        <w:r>
-          <w:rPr>
-            <w:rStyle w:val="Hyperlink"/>
-            <w:rFonts w:ascii="Times New Roman" w:eastAsia="Times New Roman" w:hAnsi="Times New Roman" w:cs="Times New Roman"/>
-            <w:kern w:val="0"/>
-            <w:szCs w:val="24"/>
-          </w:rPr>
-          <w:t>résumé</w:t>
-        </w:r>
-      </w:hyperlink>
+      <w:r>
+        <w:rPr>
+          <w:rFonts w:ascii="Times New Roman" w:eastAsia="Times New Roman" w:hAnsi="Times New Roman" w:cs="Times New Roman"/>
+          <w:kern w:val="0"/>
+          <w:szCs w:val="24"/>
+        </w:rPr>
+        <w:t>résumé</w:t>
+      </w:r>
       <w:r>
         <w:rPr>
           <w:rFonts w:ascii="Calibri" w:hAnsi="Calibri" w:cs="Calibri"/>
         </w:rPr>
         <w:t xml:space="preserve">, identifier clairement les cellules d’en-tête, utiliser un mécanisme pertinent pour lier les cellules de données aux </w:t>
       </w:r>
-      <w:hyperlink r:id="rId36" w:anchor="en-tete-de-colonne-ou-de-ligne" w:history="1">
-        <w:r>
-          <w:rPr>
-            <w:rStyle w:val="Hyperlink"/>
-            <w:rFonts w:ascii="Times New Roman" w:eastAsia="Times New Roman" w:hAnsi="Times New Roman" w:cs="Times New Roman"/>
-            <w:kern w:val="0"/>
-            <w:szCs w:val="24"/>
-          </w:rPr>
-          <w:t>cellules d’en-tête</w:t>
-        </w:r>
-      </w:hyperlink>
+      <w:r>
+        <w:rPr>
+          <w:rFonts w:ascii="Times New Roman" w:eastAsia="Times New Roman" w:hAnsi="Times New Roman" w:cs="Times New Roman"/>
+          <w:kern w:val="0"/>
+          <w:szCs w:val="24"/>
+        </w:rPr>
+        <w:t>cellules d’en-tête</w:t>
+      </w:r>
       <w:r>
         <w:rPr>
           <w:rFonts w:ascii="Calibri" w:hAnsi="Calibri" w:cs="Calibri"/>
         </w:rPr>
         <w:t xml:space="preserve">. Pour chaque </w:t>
       </w:r>
-      <w:hyperlink r:id="rId37" w:anchor="tableau-de-mise-en-forme" w:history="1">
-        <w:r>
-          <w:rPr>
-            <w:rStyle w:val="Hyperlink"/>
-            <w:rFonts w:ascii="Times New Roman" w:eastAsia="Times New Roman" w:hAnsi="Times New Roman" w:cs="Times New Roman"/>
-            <w:kern w:val="0"/>
-            <w:szCs w:val="24"/>
-          </w:rPr>
-          <w:t>tableau de mise en forme</w:t>
-        </w:r>
-      </w:hyperlink>
+      <w:r>
+        <w:rPr>
+          <w:rFonts w:ascii="Times New Roman" w:eastAsia="Times New Roman" w:hAnsi="Times New Roman" w:cs="Times New Roman"/>
+          <w:kern w:val="0"/>
+          <w:szCs w:val="24"/>
+        </w:rPr>
+        <w:t>tableau de mise en forme</w:t>
+      </w:r>
       <w:r>
         <w:rPr>
           <w:rFonts w:ascii="Calibri" w:hAnsi="Calibri" w:cs="Calibri"/>
@@ -1163,8 +1008,8 @@
       <w:pPr>
         <w:divId w:val="1256523850"/>
       </w:pPr>
-      <w:bookmarkStart w:id="7" w:name="__RefHeading__4691_384714757"/>
-      <w:bookmarkStart w:id="8" w:name="_Toc3830625791"/>
+      <w:bookmarkStart w:id="6" w:name="__RefHeading__4691_384714757"/>
+      <w:bookmarkStart w:id="7" w:name="_Toc3830625791"/>
       <w:r>
         <w:t>...</w:t>
       </w:r>
@@ -1203,247 +1048,188 @@
         </w:rPr>
         <w:t xml:space="preserve">Utiliser des </w:t>
       </w:r>
-      <w:hyperlink r:id="rId38" w:anchor="intitule-ou-nom-accessible-de-lien" w:history="1">
+      <w:r>
+        <w:rPr>
+          <w:rFonts w:asciiTheme="minorHAnsi" w:hAnsiTheme="minorHAnsi" w:cstheme="minorHAnsi"/>
+        </w:rPr>
+        <w:t>intitulés</w:t>
+      </w:r>
+      <w:r>
+        <w:rPr>
+          <w:rFonts w:asciiTheme="minorHAnsi" w:hAnsiTheme="minorHAnsi" w:cstheme="minorHAnsi"/>
+        </w:rPr>
+        <w:t xml:space="preserve"> de </w:t>
+      </w:r>
+      <w:r>
+        <w:rPr>
+          <w:rFonts w:asciiTheme="minorHAnsi" w:hAnsiTheme="minorHAnsi" w:cstheme="minorHAnsi"/>
+        </w:rPr>
+        <w:t>liens</w:t>
+      </w:r>
+      <w:r>
+        <w:rPr>
+          <w:rFonts w:asciiTheme="minorHAnsi" w:hAnsiTheme="minorHAnsi" w:cstheme="minorHAnsi"/>
+        </w:rPr>
+        <w:t xml:space="preserve"> explicites, grâce à des informations de </w:t>
+      </w:r>
+      <w:r>
+        <w:rPr>
+          <w:rFonts w:asciiTheme="minorHAnsi" w:hAnsiTheme="minorHAnsi" w:cstheme="minorHAnsi"/>
+        </w:rPr>
+        <w:t>contexte</w:t>
+      </w:r>
+      <w:r>
+        <w:rPr>
+          <w:rFonts w:asciiTheme="minorHAnsi" w:hAnsiTheme="minorHAnsi" w:cstheme="minorHAnsi"/>
+        </w:rPr>
+        <w:t xml:space="preserve"> notamment.</w:t>
+      </w:r>
+    </w:p>
+    <w:p>
+      <w:pPr>
+        <w:divId w:val="1256523850"/>
+      </w:pPr>
+      <w:r>
+        <w:t>...</w:t>
+      </w:r>
+    </w:p>
+    <w:p>
+      <w:pPr>
+        <w:pStyle w:val="Heading2"/>
+        <w:divId w:val="1256523850"/>
+      </w:pPr>
+      <w:r>
+        <w:t>Scripts</w:t>
+      </w:r>
+      <w:bookmarkEnd w:id="6"/>
+      <w:bookmarkEnd w:id="7"/>
+    </w:p>
+    <w:p>
+      <w:pPr>
+        <w:pStyle w:val="introductioncritre"/>
+        <w:divId w:val="1256523850"/>
+      </w:pPr>
+      <w:r>
+        <w:rPr>
+          <w:rFonts w:ascii="Calibri" w:hAnsi="Calibri" w:cs="Calibri"/>
+        </w:rPr>
+        <w:lastRenderedPageBreak/>
+        <w:t xml:space="preserve">Donner si nécessaire à chaque </w:t>
+      </w:r>
+      <w:r>
+        <w:rPr>
+          <w:rFonts w:ascii="Times New Roman" w:eastAsia="Times New Roman" w:hAnsi="Times New Roman" w:cs="Times New Roman"/>
+          <w:kern w:val="0"/>
+          <w:szCs w:val="24"/>
+        </w:rPr>
+        <w:t>script</w:t>
+      </w:r>
+      <w:r>
+        <w:rPr>
+          <w:rFonts w:ascii="Calibri" w:hAnsi="Calibri" w:cs="Calibri"/>
+        </w:rPr>
+        <w:t xml:space="preserve"> une </w:t>
+      </w:r>
+      <w:r>
+        <w:rPr>
+          <w:rFonts w:ascii="Times New Roman" w:eastAsia="Times New Roman" w:hAnsi="Times New Roman" w:cs="Times New Roman"/>
+          <w:kern w:val="0"/>
+          <w:szCs w:val="24"/>
+        </w:rPr>
+        <w:t>alternative</w:t>
+      </w:r>
+      <w:r>
+        <w:rPr>
+          <w:rFonts w:ascii="Calibri" w:hAnsi="Calibri" w:cs="Calibri"/>
+        </w:rPr>
+        <w:t xml:space="preserve"> pertinente. Avertir ou permettre le contrôle des scripts qui initient un </w:t>
+      </w:r>
+      <w:r>
+        <w:rPr>
+          <w:rFonts w:ascii="Times New Roman" w:eastAsia="Times New Roman" w:hAnsi="Times New Roman" w:cs="Times New Roman"/>
+          <w:kern w:val="0"/>
+          <w:szCs w:val="24"/>
+        </w:rPr>
+        <w:t>changement de contexte</w:t>
+      </w:r>
+      <w:r>
+        <w:rPr>
+          <w:rFonts w:ascii="Calibri" w:hAnsi="Calibri" w:cs="Calibri"/>
+        </w:rPr>
+        <w:t xml:space="preserve">. Rendre possible le contrôle de chaque code </w:t>
+      </w:r>
+      <w:r>
+        <w:rPr>
+          <w:rFonts w:ascii="Times New Roman" w:eastAsia="Times New Roman" w:hAnsi="Times New Roman" w:cs="Times New Roman"/>
+          <w:kern w:val="0"/>
+          <w:szCs w:val="24"/>
+        </w:rPr>
+        <w:t>script</w:t>
+      </w:r>
+      <w:r>
+        <w:rPr>
+          <w:rFonts w:ascii="Calibri" w:hAnsi="Calibri" w:cs="Calibri"/>
+        </w:rPr>
+        <w:t xml:space="preserve"> au moins </w:t>
+      </w:r>
+      <w:r>
+        <w:rPr>
+          <w:rFonts w:ascii="Times New Roman" w:eastAsia="Times New Roman" w:hAnsi="Times New Roman" w:cs="Times New Roman"/>
+          <w:kern w:val="0"/>
+          <w:szCs w:val="24"/>
+        </w:rPr>
+        <w:t xml:space="preserve">par le clavier </w:t>
+      </w:r>
+      <w:r>
+        <w:rPr>
+          <w:rFonts w:ascii="Calibri" w:hAnsi="Calibri" w:cs="Calibri"/>
+        </w:rPr>
+        <w:t>et par tout</w:t>
+      </w:r>
+      <w:hyperlink r:id="rId8" w:anchor="accessible-et-activable-par-le-clavier-et-tout-dispositif-de-pointage" w:history="1">
         <w:r>
           <w:rPr>
-            <w:rStyle w:val="Hyperlink"/>
-            <w:rFonts w:asciiTheme="minorHAnsi" w:hAnsiTheme="minorHAnsi" w:cstheme="minorHAnsi"/>
-          </w:rPr>
-          <w:t>intitulés</w:t>
-        </w:r>
-      </w:hyperlink>
-      <w:r>
-        <w:rPr>
-          <w:rFonts w:asciiTheme="minorHAnsi" w:hAnsiTheme="minorHAnsi" w:cstheme="minorHAnsi"/>
-        </w:rPr>
-        <w:t xml:space="preserve"> de </w:t>
-      </w:r>
-      <w:hyperlink r:id="rId39" w:anchor="lien" w:history="1">
-        <w:r>
-          <w:rPr>
-            <w:rStyle w:val="Hyperlink"/>
-            <w:rFonts w:asciiTheme="minorHAnsi" w:hAnsiTheme="minorHAnsi" w:cstheme="minorHAnsi"/>
-          </w:rPr>
-          <w:t>lien</w:t>
-        </w:r>
-      </w:hyperlink>
-      <w:hyperlink r:id="rId40" w:anchor="lien" w:history="1">
-        <w:r>
-          <w:rPr>
-            <w:rStyle w:val="Hyperlink"/>
-            <w:rFonts w:asciiTheme="minorHAnsi" w:hAnsiTheme="minorHAnsi" w:cstheme="minorHAnsi"/>
-          </w:rPr>
-          <w:t>s</w:t>
-        </w:r>
-      </w:hyperlink>
-      <w:r>
-        <w:rPr>
-          <w:rFonts w:asciiTheme="minorHAnsi" w:hAnsiTheme="minorHAnsi" w:cstheme="minorHAnsi"/>
-        </w:rPr>
-        <w:t xml:space="preserve"> explicites, grâce à des informations de </w:t>
-      </w:r>
-      <w:hyperlink r:id="rId41" w:anchor="contexte-du-lien" w:history="1">
-        <w:r>
-          <w:rPr>
-            <w:rStyle w:val="Hyperlink"/>
-            <w:rFonts w:asciiTheme="minorHAnsi" w:hAnsiTheme="minorHAnsi" w:cstheme="minorHAnsi"/>
-          </w:rPr>
-          <w:t>contexte</w:t>
-        </w:r>
-      </w:hyperlink>
-      <w:r>
-        <w:rPr>
-          <w:rFonts w:asciiTheme="minorHAnsi" w:hAnsiTheme="minorHAnsi" w:cstheme="minorHAnsi"/>
-        </w:rPr>
-        <w:t xml:space="preserve"> notamment.</w:t>
-      </w:r>
-    </w:p>
-    <w:p>
-      <w:pPr>
-        <w:divId w:val="1256523850"/>
-      </w:pPr>
-      <w:r>
-        <w:t>...</w:t>
-      </w:r>
-    </w:p>
-    <w:p>
-      <w:pPr>
-        <w:pStyle w:val="Heading2"/>
-        <w:divId w:val="1256523850"/>
-      </w:pPr>
-      <w:r>
-        <w:t>Scripts</w:t>
-      </w:r>
-      <w:bookmarkEnd w:id="7"/>
-      <w:bookmarkEnd w:id="8"/>
-    </w:p>
-    <w:p>
-      <w:pPr>
-        <w:pStyle w:val="introductioncritre"/>
-        <w:divId w:val="1256523850"/>
-      </w:pPr>
-      <w:r>
-        <w:rPr>
-          <w:rFonts w:ascii="Calibri" w:hAnsi="Calibri" w:cs="Calibri"/>
-        </w:rPr>
-        <w:lastRenderedPageBreak/>
-        <w:t xml:space="preserve">Donner si nécessaire à chaque </w:t>
-      </w:r>
-      <w:hyperlink r:id="rId42" w:anchor="script" w:history="1">
-        <w:r>
-          <w:rPr>
-            <w:rStyle w:val="Hyperlink"/>
-            <w:rFonts w:ascii="Times New Roman" w:eastAsia="Times New Roman" w:hAnsi="Times New Roman" w:cs="Times New Roman"/>
-            <w:kern w:val="0"/>
-            <w:szCs w:val="24"/>
-          </w:rPr>
-          <w:t>script</w:t>
-        </w:r>
-      </w:hyperlink>
-      <w:r>
-        <w:rPr>
-          <w:rFonts w:ascii="Calibri" w:hAnsi="Calibri" w:cs="Calibri"/>
-        </w:rPr>
-        <w:t xml:space="preserve"> une </w:t>
-      </w:r>
-      <w:hyperlink r:id="rId43" w:anchor="alternative-a-script" w:history="1">
-        <w:r>
-          <w:rPr>
-            <w:rStyle w:val="Hyperlink"/>
-            <w:rFonts w:ascii="Times New Roman" w:eastAsia="Times New Roman" w:hAnsi="Times New Roman" w:cs="Times New Roman"/>
-            <w:kern w:val="0"/>
-            <w:szCs w:val="24"/>
-          </w:rPr>
-          <w:t>alternative</w:t>
-        </w:r>
-      </w:hyperlink>
-      <w:r>
-        <w:rPr>
-          <w:rFonts w:ascii="Calibri" w:hAnsi="Calibri" w:cs="Calibri"/>
-        </w:rPr>
-        <w:t xml:space="preserve"> pertinente. Avertir ou permettre le contrôle des scripts qui initient un </w:t>
-      </w:r>
-      <w:hyperlink r:id="rId44" w:anchor="changement-de-contexte" w:history="1">
-        <w:r>
-          <w:rPr>
-            <w:rStyle w:val="Hyperlink"/>
-            <w:rFonts w:ascii="Times New Roman" w:eastAsia="Times New Roman" w:hAnsi="Times New Roman" w:cs="Times New Roman"/>
-            <w:kern w:val="0"/>
-            <w:szCs w:val="24"/>
-          </w:rPr>
-          <w:t>changement de contexte</w:t>
-        </w:r>
-      </w:hyperlink>
-      <w:r>
-        <w:rPr>
-          <w:rFonts w:ascii="Calibri" w:hAnsi="Calibri" w:cs="Calibri"/>
-        </w:rPr>
-        <w:t xml:space="preserve">. Rendre possible le contrôle de chaque code </w:t>
-      </w:r>
-      <w:hyperlink r:id="rId45" w:anchor="script" w:history="1">
-        <w:r>
-          <w:rPr>
-            <w:rStyle w:val="Hyperlink"/>
-            <w:rFonts w:ascii="Times New Roman" w:eastAsia="Times New Roman" w:hAnsi="Times New Roman" w:cs="Times New Roman"/>
-            <w:kern w:val="0"/>
-            <w:szCs w:val="24"/>
-          </w:rPr>
-          <w:t>script</w:t>
-        </w:r>
-      </w:hyperlink>
-      <w:r>
-        <w:rPr>
-          <w:rFonts w:ascii="Calibri" w:hAnsi="Calibri" w:cs="Calibri"/>
-        </w:rPr>
-        <w:t xml:space="preserve"> au moins </w:t>
-      </w:r>
-      <w:hyperlink r:id="rId46" w:anchor="accessible-et-activable-par-le-clavier-et-tout-dispositif-de-pointage" w:history="1">
-        <w:r>
-          <w:rPr>
-            <w:rStyle w:val="Hyperlink"/>
-            <w:rFonts w:ascii="Times New Roman" w:eastAsia="Times New Roman" w:hAnsi="Times New Roman" w:cs="Times New Roman"/>
-            <w:kern w:val="0"/>
-            <w:szCs w:val="24"/>
-          </w:rPr>
-          <w:t xml:space="preserve">par le clavier et </w:t>
-        </w:r>
-      </w:hyperlink>
-      <w:r>
-        <w:rPr>
-          <w:rStyle w:val="Hyperlink"/>
-          <w:rFonts w:ascii="Times New Roman" w:eastAsia="Times New Roman" w:hAnsi="Times New Roman" w:cs="Times New Roman"/>
-          <w:kern w:val="0"/>
-          <w:szCs w:val="24"/>
-        </w:rPr>
-        <w:t xml:space="preserve">par </w:t>
-      </w:r>
-      <w:hyperlink r:id="rId47" w:anchor="accessible-et-activable-par-le-clavier-et-tout-dispositif-de-pointage" w:history="1">
-        <w:r>
-          <w:rPr>
-            <w:rStyle w:val="Hyperlink"/>
-            <w:rFonts w:ascii="Times New Roman" w:eastAsia="Times New Roman" w:hAnsi="Times New Roman" w:cs="Times New Roman"/>
-            <w:kern w:val="0"/>
-            <w:szCs w:val="24"/>
-          </w:rPr>
-          <w:t>tout</w:t>
-        </w:r>
-      </w:hyperlink>
-      <w:hyperlink r:id="rId48" w:anchor="accessible-et-activable-par-le-clavier-et-tout-dispositif-de-pointage" w:history="1">
-        <w:r>
-          <w:rPr>
-            <w:rStyle w:val="Hyperlink"/>
-            <w:rFonts w:ascii="Times New Roman" w:eastAsia="Times New Roman" w:hAnsi="Times New Roman" w:cs="Times New Roman"/>
-            <w:kern w:val="0"/>
-            <w:szCs w:val="24"/>
+            <w:rFonts w:ascii="Calibri" w:hAnsi="Calibri" w:cs="Calibri"/>
           </w:rPr>
           <w:t xml:space="preserve"> </w:t>
         </w:r>
       </w:hyperlink>
-      <w:hyperlink r:id="rId49" w:anchor="accessible-et-activable-par-le-clavier-et-tout-dispositif-de-pointage" w:history="1">
-        <w:r>
-          <w:rPr>
-            <w:rStyle w:val="Hyperlink"/>
-            <w:rFonts w:ascii="Times New Roman" w:eastAsia="Times New Roman" w:hAnsi="Times New Roman" w:cs="Times New Roman"/>
-            <w:kern w:val="0"/>
-            <w:szCs w:val="24"/>
-          </w:rPr>
-          <w:t>dispositif de pointage</w:t>
-        </w:r>
-      </w:hyperlink>
+      <w:r>
+        <w:rPr>
+          <w:rFonts w:ascii="Times New Roman" w:eastAsia="Times New Roman" w:hAnsi="Times New Roman" w:cs="Times New Roman"/>
+          <w:kern w:val="0"/>
+          <w:szCs w:val="24"/>
+        </w:rPr>
+        <w:t>dispositif de pointage</w:t>
+      </w:r>
       <w:r>
         <w:rPr>
           <w:rFonts w:ascii="Calibri" w:hAnsi="Calibri" w:cs="Calibri"/>
         </w:rPr>
         <w:t xml:space="preserve"> et s’assurer de leur </w:t>
       </w:r>
-      <w:hyperlink r:id="rId50" w:anchor="compatible-avec-les-technologies-d-assistance" w:history="1">
-        <w:r>
-          <w:rPr>
-            <w:rStyle w:val="Hyperlink"/>
-            <w:rFonts w:ascii="Times New Roman" w:eastAsia="Times New Roman" w:hAnsi="Times New Roman" w:cs="Times New Roman"/>
-            <w:kern w:val="0"/>
-            <w:szCs w:val="24"/>
-          </w:rPr>
-          <w:t>compatibilité avec les technologies d’assistance</w:t>
-        </w:r>
-      </w:hyperlink>
+      <w:r>
+        <w:rPr>
+          <w:rFonts w:ascii="Times New Roman" w:eastAsia="Times New Roman" w:hAnsi="Times New Roman" w:cs="Times New Roman"/>
+          <w:kern w:val="0"/>
+          <w:szCs w:val="24"/>
+        </w:rPr>
+        <w:t>compatibilité avec les technologies d’assistance</w:t>
+      </w:r>
       <w:r>
         <w:rPr>
           <w:rFonts w:ascii="Calibri" w:hAnsi="Calibri" w:cs="Calibri"/>
         </w:rPr>
         <w:t xml:space="preserve"> notamment pour les </w:t>
       </w:r>
-      <w:hyperlink r:id="rId51" w:anchor="message-de-statut" w:history="1">
-        <w:r>
-          <w:rPr>
-            <w:rStyle w:val="Hyperlink"/>
-            <w:rFonts w:ascii="Times New Roman" w:eastAsia="Times New Roman" w:hAnsi="Times New Roman" w:cs="Times New Roman"/>
-            <w:kern w:val="0"/>
-            <w:szCs w:val="24"/>
-          </w:rPr>
-          <w:t>messages de statut</w:t>
-        </w:r>
-      </w:hyperlink>
+      <w:r>
+        <w:rPr>
+          <w:rFonts w:ascii="Times New Roman" w:eastAsia="Times New Roman" w:hAnsi="Times New Roman" w:cs="Times New Roman"/>
+          <w:kern w:val="0"/>
+          <w:szCs w:val="24"/>
+        </w:rPr>
+        <w:t>messages de statut</w:t>
+      </w:r>
       <w:r>
         <w:rPr>
           <w:rFonts w:ascii="Calibri" w:hAnsi="Calibri" w:cs="Calibri"/>
@@ -1455,8 +1241,8 @@
       <w:pPr>
         <w:divId w:val="1256523850"/>
       </w:pPr>
-      <w:bookmarkStart w:id="9" w:name="__RefHeading__952_1454273984"/>
-      <w:bookmarkStart w:id="10" w:name="_Toc383062580"/>
+      <w:bookmarkStart w:id="8" w:name="__RefHeading__952_1454273984"/>
+      <w:bookmarkStart w:id="9" w:name="_Toc383062580"/>
       <w:r>
         <w:t>...</w:t>
       </w:r>
@@ -1469,8 +1255,8 @@
       <w:r>
         <w:t>Éléments obligatoires</w:t>
       </w:r>
+      <w:bookmarkEnd w:id="8"/>
       <w:bookmarkEnd w:id="9"/>
-      <w:bookmarkEnd w:id="10"/>
     </w:p>
     <w:p>
       <w:pPr>
@@ -1483,125 +1269,98 @@
         </w:rPr>
         <w:t xml:space="preserve">Vérifier que dans chaque page Web, le code source généré respecte </w:t>
       </w:r>
-      <w:hyperlink r:id="rId52" w:anchor="regles-d-ecriture" w:history="1">
-        <w:r>
-          <w:rPr>
-            <w:rStyle w:val="Hyperlink"/>
-            <w:rFonts w:ascii="Times New Roman" w:eastAsia="Times New Roman" w:hAnsi="Times New Roman" w:cs="Times New Roman"/>
-            <w:kern w:val="0"/>
-            <w:szCs w:val="24"/>
-          </w:rPr>
-          <w:t>les règles d’écriture</w:t>
-        </w:r>
-      </w:hyperlink>
+      <w:r>
+        <w:rPr>
+          <w:rFonts w:ascii="Times New Roman" w:eastAsia="Times New Roman" w:hAnsi="Times New Roman" w:cs="Times New Roman"/>
+          <w:kern w:val="0"/>
+          <w:szCs w:val="24"/>
+        </w:rPr>
+        <w:t>les règles d’écriture</w:t>
+      </w:r>
       <w:r>
         <w:rPr>
           <w:rFonts w:ascii="Calibri" w:hAnsi="Calibri" w:cs="Calibri"/>
         </w:rPr>
         <w:t xml:space="preserve"> correspondant au </w:t>
       </w:r>
-      <w:hyperlink r:id="rId53" w:anchor="type-de-document" w:history="1">
-        <w:r>
-          <w:rPr>
-            <w:rStyle w:val="Hyperlink"/>
-            <w:rFonts w:ascii="Times New Roman" w:eastAsia="Times New Roman" w:hAnsi="Times New Roman" w:cs="Times New Roman"/>
-            <w:kern w:val="0"/>
-            <w:szCs w:val="24"/>
-          </w:rPr>
-          <w:t>type de document</w:t>
-        </w:r>
-      </w:hyperlink>
+      <w:r>
+        <w:rPr>
+          <w:rFonts w:ascii="Times New Roman" w:eastAsia="Times New Roman" w:hAnsi="Times New Roman" w:cs="Times New Roman"/>
+          <w:kern w:val="0"/>
+          <w:szCs w:val="24"/>
+        </w:rPr>
+        <w:t>type de document</w:t>
+      </w:r>
       <w:r>
         <w:rPr>
           <w:rFonts w:ascii="Calibri" w:hAnsi="Calibri" w:cs="Calibri"/>
         </w:rPr>
         <w:t xml:space="preserve">, que le </w:t>
       </w:r>
-      <w:hyperlink r:id="rId54" w:anchor="titre-de-page" w:history="1">
-        <w:r>
-          <w:rPr>
-            <w:rStyle w:val="Hyperlink"/>
-            <w:rFonts w:ascii="Times New Roman" w:eastAsia="Times New Roman" w:hAnsi="Times New Roman" w:cs="Times New Roman"/>
-            <w:kern w:val="0"/>
-            <w:szCs w:val="24"/>
-          </w:rPr>
-          <w:t>titre</w:t>
-        </w:r>
-      </w:hyperlink>
+      <w:r>
+        <w:rPr>
+          <w:rFonts w:ascii="Times New Roman" w:eastAsia="Times New Roman" w:hAnsi="Times New Roman" w:cs="Times New Roman"/>
+          <w:kern w:val="0"/>
+          <w:szCs w:val="24"/>
+        </w:rPr>
+        <w:t>titre</w:t>
+      </w:r>
       <w:r>
         <w:rPr>
           <w:rFonts w:ascii="Calibri" w:hAnsi="Calibri" w:cs="Calibri"/>
         </w:rPr>
         <w:t xml:space="preserve"> est pertinent et la </w:t>
       </w:r>
-      <w:hyperlink r:id="rId55" w:anchor="langue-par-defaut" w:history="1">
-        <w:r>
-          <w:rPr>
-            <w:rStyle w:val="Hyperlink"/>
-            <w:rFonts w:ascii="Times New Roman" w:eastAsia="Times New Roman" w:hAnsi="Times New Roman" w:cs="Times New Roman"/>
-            <w:kern w:val="0"/>
-            <w:szCs w:val="24"/>
-          </w:rPr>
-          <w:t>langue par défaut</w:t>
-        </w:r>
-      </w:hyperlink>
+      <w:r>
+        <w:rPr>
+          <w:rFonts w:ascii="Times New Roman" w:eastAsia="Times New Roman" w:hAnsi="Times New Roman" w:cs="Times New Roman"/>
+          <w:kern w:val="0"/>
+          <w:szCs w:val="24"/>
+        </w:rPr>
+        <w:t>langue par défaut</w:t>
+      </w:r>
       <w:r>
         <w:rPr>
           <w:rFonts w:ascii="Calibri" w:hAnsi="Calibri" w:cs="Calibri"/>
         </w:rPr>
         <w:t xml:space="preserve">, indiquée. Vérifier que les balises ne sont pas utilisées </w:t>
       </w:r>
-      <w:hyperlink r:id="rId56" w:anchor="uniquement-a-des-fins-de-presentation" w:history="1">
-        <w:r>
-          <w:rPr>
-            <w:rStyle w:val="Hyperlink"/>
-            <w:rFonts w:ascii="Times New Roman" w:eastAsia="Times New Roman" w:hAnsi="Times New Roman" w:cs="Times New Roman"/>
-            <w:kern w:val="0"/>
-            <w:szCs w:val="24"/>
-          </w:rPr>
-          <w:t>uniquement à des fins de présentation</w:t>
-        </w:r>
-      </w:hyperlink>
-      <w:r>
-        <w:rPr>
-          <w:rFonts w:ascii="Calibri" w:hAnsi="Calibri" w:cs="Calibri"/>
-        </w:rPr>
-        <w:t xml:space="preserve">, que </w:t>
-      </w:r>
-      <w:hyperlink r:id="rId57" w:anchor="changement-de-langue" w:history="1">
-        <w:r>
-          <w:rPr>
-            <w:rFonts w:ascii="Calibri" w:hAnsi="Calibri" w:cs="Calibri"/>
-          </w:rPr>
-          <w:t xml:space="preserve">les </w:t>
-        </w:r>
-        <w:r>
-          <w:rPr>
-            <w:rStyle w:val="Hyperlink"/>
-            <w:rFonts w:ascii="Times New Roman" w:eastAsia="Times New Roman" w:hAnsi="Times New Roman" w:cs="Times New Roman"/>
-            <w:kern w:val="0"/>
-            <w:szCs w:val="24"/>
-          </w:rPr>
-          <w:t>changements de langues</w:t>
-        </w:r>
-      </w:hyperlink>
+      <w:r>
+        <w:rPr>
+          <w:rFonts w:ascii="Times New Roman" w:eastAsia="Times New Roman" w:hAnsi="Times New Roman" w:cs="Times New Roman"/>
+          <w:kern w:val="0"/>
+          <w:szCs w:val="24"/>
+        </w:rPr>
+        <w:t>uniquement à des fins de présentation</w:t>
+      </w:r>
+      <w:r>
+        <w:rPr>
+          <w:rFonts w:ascii="Calibri" w:hAnsi="Calibri" w:cs="Calibri"/>
+        </w:rPr>
+        <w:t xml:space="preserve">, que les </w:t>
+      </w:r>
+      <w:r>
+        <w:rPr>
+          <w:rFonts w:ascii="Times New Roman" w:eastAsia="Times New Roman" w:hAnsi="Times New Roman" w:cs="Times New Roman"/>
+          <w:kern w:val="0"/>
+          <w:szCs w:val="24"/>
+        </w:rPr>
+        <w:t>changements de langues</w:t>
+      </w:r>
       <w:r>
         <w:rPr>
           <w:rFonts w:ascii="Calibri" w:hAnsi="Calibri" w:cs="Calibri"/>
         </w:rPr>
         <w:t xml:space="preserve"> et de direction de </w:t>
       </w:r>
-      <w:hyperlink r:id="rId58" w:anchor="sens-de-lecture" w:history="1">
-        <w:r>
-          <w:rPr>
-            <w:rStyle w:val="Hyperlink"/>
-            <w:rFonts w:ascii="Times New Roman" w:eastAsia="Times New Roman" w:hAnsi="Times New Roman" w:cs="Times New Roman"/>
-            <w:kern w:val="0"/>
-            <w:szCs w:val="24"/>
-          </w:rPr>
-          <w:t>sens de lecture</w:t>
-        </w:r>
-      </w:hyperlink>
+      <w:r>
+        <w:rPr>
+          <w:rFonts w:ascii="Times New Roman" w:eastAsia="Times New Roman" w:hAnsi="Times New Roman" w:cs="Times New Roman"/>
+          <w:kern w:val="0"/>
+          <w:szCs w:val="24"/>
+        </w:rPr>
+        <w:t>sens de lecture</w:t>
+      </w:r>
       <w:r>
         <w:rPr>
           <w:rFonts w:ascii="Calibri" w:hAnsi="Calibri" w:cs="Calibri"/>
@@ -1613,8 +1372,8 @@
       <w:pPr>
         <w:divId w:val="1256523850"/>
       </w:pPr>
-      <w:bookmarkStart w:id="11" w:name="__RefHeading__954_1454273984"/>
-      <w:bookmarkStart w:id="12" w:name="_Toc383062581"/>
+      <w:bookmarkStart w:id="10" w:name="__RefHeading__954_1454273984"/>
+      <w:bookmarkStart w:id="11" w:name="_Toc383062581"/>
       <w:r>
         <w:t>...</w:t>
       </w:r>
@@ -1627,8 +1386,8 @@
       <w:r>
         <w:t>Structuration de l’information</w:t>
       </w:r>
+      <w:bookmarkEnd w:id="10"/>
       <w:bookmarkEnd w:id="11"/>
-      <w:bookmarkEnd w:id="12"/>
     </w:p>
     <w:p>
       <w:pPr>
@@ -1641,34 +1400,28 @@
         </w:rPr>
         <w:t xml:space="preserve">Utiliser des </w:t>
       </w:r>
-      <w:hyperlink r:id="rId59" w:anchor="titre" w:history="1">
-        <w:r>
-          <w:rPr>
-            <w:rStyle w:val="Hyperlink"/>
-            <w:rFonts w:ascii="Times New Roman" w:eastAsia="Times New Roman" w:hAnsi="Times New Roman" w:cs="Times New Roman"/>
-            <w:kern w:val="0"/>
-            <w:szCs w:val="24"/>
-          </w:rPr>
-          <w:t>titres</w:t>
-        </w:r>
-      </w:hyperlink>
+      <w:r>
+        <w:rPr>
+          <w:rFonts w:ascii="Times New Roman" w:eastAsia="Times New Roman" w:hAnsi="Times New Roman" w:cs="Times New Roman"/>
+          <w:kern w:val="0"/>
+          <w:szCs w:val="24"/>
+        </w:rPr>
+        <w:t>titres</w:t>
+      </w:r>
       <w:r>
         <w:rPr>
           <w:rFonts w:ascii="Calibri" w:hAnsi="Calibri" w:cs="Calibri"/>
         </w:rPr>
         <w:t xml:space="preserve">, des </w:t>
       </w:r>
-      <w:hyperlink r:id="rId60" w:anchor="listes" w:history="1">
-        <w:r>
-          <w:rPr>
-            <w:rStyle w:val="Hyperlink"/>
-            <w:rFonts w:ascii="Times New Roman" w:eastAsia="Times New Roman" w:hAnsi="Times New Roman" w:cs="Times New Roman"/>
-            <w:kern w:val="0"/>
-            <w:szCs w:val="24"/>
-          </w:rPr>
-          <w:t>listes</w:t>
-        </w:r>
-      </w:hyperlink>
+      <w:r>
+        <w:rPr>
+          <w:rFonts w:ascii="Times New Roman" w:eastAsia="Times New Roman" w:hAnsi="Times New Roman" w:cs="Times New Roman"/>
+          <w:kern w:val="0"/>
+          <w:szCs w:val="24"/>
+        </w:rPr>
+        <w:t>listes</w:t>
+      </w:r>
       <w:r>
         <w:rPr>
           <w:rFonts w:ascii="Calibri" w:hAnsi="Calibri" w:cs="Calibri"/>
@@ -1680,8 +1433,8 @@
       <w:pPr>
         <w:divId w:val="1256523850"/>
       </w:pPr>
-      <w:bookmarkStart w:id="13" w:name="_Toc383062582"/>
-      <w:bookmarkStart w:id="14" w:name="__RefHeading__956_1454273984"/>
+      <w:bookmarkStart w:id="12" w:name="_Toc383062582"/>
+      <w:bookmarkStart w:id="13" w:name="__RefHeading__956_1454273984"/>
       <w:r>
         <w:t>...</w:t>
       </w:r>
@@ -1720,142 +1473,85 @@
         </w:rPr>
         <w:t xml:space="preserve">Utiliser des </w:t>
       </w:r>
-      <w:hyperlink r:id="rId61" w:anchor="feuille-de-style" w:history="1">
-        <w:r>
-          <w:rPr>
-            <w:rStyle w:val="Hyperlink"/>
-            <w:rFonts w:asciiTheme="minorHAnsi" w:hAnsiTheme="minorHAnsi" w:cstheme="minorHAnsi"/>
-          </w:rPr>
-          <w:t>feuilles de styles</w:t>
-        </w:r>
-      </w:hyperlink>
+      <w:r>
+        <w:rPr>
+          <w:rFonts w:asciiTheme="minorHAnsi" w:hAnsiTheme="minorHAnsi" w:cstheme="minorHAnsi"/>
+        </w:rPr>
+        <w:t>feuilles de styles</w:t>
+      </w:r>
       <w:r>
         <w:rPr>
           <w:rFonts w:asciiTheme="minorHAnsi" w:hAnsiTheme="minorHAnsi" w:cstheme="minorHAnsi"/>
         </w:rPr>
         <w:t xml:space="preserve"> pour </w:t>
       </w:r>
-      <w:hyperlink r:id="rId62" w:anchor="presentation-de-l-information" w:history="1">
-        <w:r>
-          <w:rPr>
-            <w:rStyle w:val="Hyperlink"/>
-            <w:rFonts w:asciiTheme="minorHAnsi" w:hAnsiTheme="minorHAnsi" w:cstheme="minorHAnsi"/>
-          </w:rPr>
-          <w:t>présent</w:t>
-        </w:r>
-      </w:hyperlink>
-      <w:hyperlink r:id="rId63" w:anchor="presentation-de-l-information" w:history="1">
-        <w:r>
-          <w:rPr>
-            <w:rStyle w:val="Hyperlink"/>
-            <w:rFonts w:asciiTheme="minorHAnsi" w:hAnsiTheme="minorHAnsi" w:cstheme="minorHAnsi"/>
-          </w:rPr>
-          <w:t>er</w:t>
-        </w:r>
-      </w:hyperlink>
-      <w:hyperlink r:id="rId64" w:anchor="presentation-de-l-information" w:history="1">
-        <w:r>
-          <w:rPr>
-            <w:rStyle w:val="Hyperlink"/>
-            <w:rFonts w:asciiTheme="minorHAnsi" w:hAnsiTheme="minorHAnsi" w:cstheme="minorHAnsi"/>
-          </w:rPr>
-          <w:t xml:space="preserve"> de l’information</w:t>
-        </w:r>
-      </w:hyperlink>
+      <w:r>
+        <w:rPr>
+          <w:rFonts w:asciiTheme="minorHAnsi" w:hAnsiTheme="minorHAnsi" w:cstheme="minorHAnsi"/>
+        </w:rPr>
+        <w:t>présenter de l’information</w:t>
+      </w:r>
       <w:r>
         <w:rPr>
           <w:rFonts w:asciiTheme="minorHAnsi" w:hAnsiTheme="minorHAnsi" w:cstheme="minorHAnsi"/>
         </w:rPr>
         <w:t xml:space="preserve">. S’assurer que l’information reste </w:t>
       </w:r>
-      <w:hyperlink r:id="rId65" w:anchor="comprehensible-ordre-de-lecture" w:history="1">
-        <w:r>
-          <w:rPr>
-            <w:rStyle w:val="Hyperlink"/>
-            <w:rFonts w:asciiTheme="minorHAnsi" w:hAnsiTheme="minorHAnsi" w:cstheme="minorHAnsi"/>
-          </w:rPr>
-          <w:t>compréhensible</w:t>
-        </w:r>
-      </w:hyperlink>
+      <w:r>
+        <w:rPr>
+          <w:rFonts w:asciiTheme="minorHAnsi" w:hAnsiTheme="minorHAnsi" w:cstheme="minorHAnsi"/>
+        </w:rPr>
+        <w:t>compréhensible</w:t>
+      </w:r>
       <w:r>
         <w:rPr>
           <w:rFonts w:asciiTheme="minorHAnsi" w:hAnsiTheme="minorHAnsi" w:cstheme="minorHAnsi"/>
         </w:rPr>
         <w:t xml:space="preserve"> lorsque les feuilles de styles sont désactivées. Vérifier l’effet de l’agrandissement à 200 % de la </w:t>
       </w:r>
-      <w:hyperlink r:id="rId66" w:anchor="taille-des-caracteres" w:history="1">
-        <w:r>
-          <w:rPr>
-            <w:rStyle w:val="Hyperlink"/>
-            <w:rFonts w:asciiTheme="minorHAnsi" w:hAnsiTheme="minorHAnsi" w:cstheme="minorHAnsi"/>
-          </w:rPr>
-          <w:t>taille des caractères</w:t>
-        </w:r>
-      </w:hyperlink>
+      <w:r>
+        <w:rPr>
+          <w:rFonts w:asciiTheme="minorHAnsi" w:hAnsiTheme="minorHAnsi" w:cstheme="minorHAnsi"/>
+        </w:rPr>
+        <w:t>taille des caractères</w:t>
+      </w:r>
       <w:r>
         <w:rPr>
           <w:rFonts w:asciiTheme="minorHAnsi" w:hAnsiTheme="minorHAnsi" w:cstheme="minorHAnsi"/>
         </w:rPr>
         <w:t xml:space="preserve"> et de la redéfinition des propriétés d’espacement sur la lisibilité. S’assurer que les liens sont correctement identifiables, que la </w:t>
       </w:r>
-      <w:hyperlink r:id="rId67" w:anchor="prise-de-focus" w:history="1">
-        <w:r>
-          <w:rPr>
-            <w:rStyle w:val="Hyperlink"/>
-            <w:rFonts w:asciiTheme="minorHAnsi" w:hAnsiTheme="minorHAnsi" w:cstheme="minorHAnsi"/>
-          </w:rPr>
-          <w:t>prise de focus</w:t>
-        </w:r>
-      </w:hyperlink>
+      <w:r>
+        <w:rPr>
+          <w:rFonts w:asciiTheme="minorHAnsi" w:hAnsiTheme="minorHAnsi" w:cstheme="minorHAnsi"/>
+        </w:rPr>
+        <w:t>prise de focus</w:t>
+      </w:r>
       <w:r>
         <w:rPr>
           <w:rFonts w:asciiTheme="minorHAnsi" w:hAnsiTheme="minorHAnsi" w:cstheme="minorHAnsi"/>
         </w:rPr>
         <w:t xml:space="preserve"> est signalée et que l’utilisateur a le contrôle des contenus additionnels qui deviennent visibles au survol ou au focus. S’assurer que les </w:t>
       </w:r>
-      <w:hyperlink r:id="rId68" w:anchor="contenu-cache" w:history="1">
-        <w:r>
-          <w:rPr>
-            <w:rStyle w:val="Hyperlink"/>
-            <w:rFonts w:asciiTheme="minorHAnsi" w:hAnsiTheme="minorHAnsi" w:cstheme="minorHAnsi"/>
-          </w:rPr>
-          <w:t>contenus</w:t>
-        </w:r>
-      </w:hyperlink>
-      <w:hyperlink r:id="rId69" w:anchor="contenu-cache" w:history="1">
-        <w:r>
-          <w:rPr>
-            <w:rStyle w:val="Hyperlink"/>
-            <w:rFonts w:asciiTheme="minorHAnsi" w:hAnsiTheme="minorHAnsi" w:cstheme="minorHAnsi"/>
-          </w:rPr>
-          <w:t xml:space="preserve"> cachés</w:t>
-        </w:r>
-      </w:hyperlink>
+      <w:r>
+        <w:rPr>
+          <w:rFonts w:asciiTheme="minorHAnsi" w:hAnsiTheme="minorHAnsi" w:cstheme="minorHAnsi"/>
+        </w:rPr>
+        <w:t>contenus cachés</w:t>
+      </w:r>
       <w:r>
         <w:rPr>
           <w:rFonts w:asciiTheme="minorHAnsi" w:hAnsiTheme="minorHAnsi" w:cstheme="minorHAnsi"/>
         </w:rPr>
         <w:t xml:space="preserve"> sont ignorés par les technologies d’assistance et que l’information n’est pas donnée uniquement par la </w:t>
       </w:r>
-      <w:hyperlink r:id="rId70" w:anchor="indication-donnee-par-la-forme-la-taille-ou-la-position" w:history="1">
-        <w:r>
-          <w:rPr>
-            <w:rStyle w:val="Hyperlink"/>
-            <w:rFonts w:asciiTheme="minorHAnsi" w:hAnsiTheme="minorHAnsi" w:cstheme="minorHAnsi"/>
-          </w:rPr>
-          <w:t>form</w:t>
-        </w:r>
-      </w:hyperlink>
-      <w:hyperlink r:id="rId71" w:anchor="indication-donnee-par-la-forme-la-taille-ou-la-position" w:history="1">
-        <w:r>
-          <w:rPr>
-            <w:rStyle w:val="Hyperlink"/>
-            <w:rFonts w:asciiTheme="minorHAnsi" w:hAnsiTheme="minorHAnsi" w:cstheme="minorHAnsi"/>
-          </w:rPr>
-          <w:t>e, taille ou</w:t>
-        </w:r>
-      </w:hyperlink>
-      <w:hyperlink r:id="rId72" w:anchor="indication-donnee-par-la-forme-la-taille-ou-la-position" w:history="1">
+      <w:r>
+        <w:rPr>
+          <w:rFonts w:asciiTheme="minorHAnsi" w:hAnsiTheme="minorHAnsi" w:cstheme="minorHAnsi"/>
+        </w:rPr>
+        <w:t>forme, taille ou</w:t>
+      </w:r>
+      <w:hyperlink r:id="rId9" w:anchor="indication-donnee-par-la-forme-la-taille-ou-la-position" w:history="1">
         <w:r>
           <w:rPr>
             <w:rStyle w:val="Hyperlink"/>
@@ -1864,15 +1560,12 @@
           <w:t xml:space="preserve"> </w:t>
         </w:r>
       </w:hyperlink>
-      <w:hyperlink r:id="rId73" w:anchor="indication-donnee-par-la-forme-la-taille-ou-la-position" w:history="1">
-        <w:r>
-          <w:rPr>
-            <w:rStyle w:val="Hyperlink"/>
-            <w:rFonts w:asciiTheme="minorHAnsi" w:hAnsiTheme="minorHAnsi" w:cstheme="minorHAnsi"/>
-          </w:rPr>
-          <w:t>position</w:t>
-        </w:r>
-      </w:hyperlink>
+      <w:r>
+        <w:rPr>
+          <w:rFonts w:asciiTheme="minorHAnsi" w:hAnsiTheme="minorHAnsi" w:cstheme="minorHAnsi"/>
+        </w:rPr>
+        <w:t>position</w:t>
+      </w:r>
       <w:r>
         <w:rPr>
           <w:rFonts w:asciiTheme="minorHAnsi" w:hAnsiTheme="minorHAnsi" w:cstheme="minorHAnsi"/>
@@ -1896,11 +1589,11 @@
       <w:r>
         <w:t>Formulaire</w:t>
       </w:r>
+      <w:bookmarkEnd w:id="12"/>
+      <w:r>
+        <w:t>s</w:t>
+      </w:r>
       <w:bookmarkEnd w:id="13"/>
-      <w:r>
-        <w:t>s</w:t>
-      </w:r>
-      <w:bookmarkEnd w:id="14"/>
     </w:p>
     <w:p>
       <w:pPr>
@@ -1913,79 +1606,56 @@
         </w:rPr>
         <w:t xml:space="preserve">Pour chaque formulaire, associer chacun de ses </w:t>
       </w:r>
-      <w:hyperlink r:id="rId74" w:anchor="champ-de-saisie-de-formulaire" w:history="1">
-        <w:r>
-          <w:rPr>
-            <w:rStyle w:val="Hyperlink"/>
-            <w:rFonts w:ascii="Times New Roman" w:eastAsia="Times New Roman" w:hAnsi="Times New Roman" w:cs="Times New Roman"/>
-            <w:kern w:val="0"/>
-            <w:szCs w:val="24"/>
-          </w:rPr>
-          <w:t>champs</w:t>
-        </w:r>
-      </w:hyperlink>
+      <w:r>
+        <w:rPr>
+          <w:rFonts w:ascii="Times New Roman" w:eastAsia="Times New Roman" w:hAnsi="Times New Roman" w:cs="Times New Roman"/>
+          <w:kern w:val="0"/>
+          <w:szCs w:val="24"/>
+        </w:rPr>
+        <w:t>champs</w:t>
+      </w:r>
       <w:r>
         <w:rPr>
           <w:rFonts w:ascii="Calibri" w:hAnsi="Calibri" w:cs="Calibri"/>
         </w:rPr>
         <w:t xml:space="preserve"> à son </w:t>
       </w:r>
-      <w:hyperlink r:id="rId75" w:anchor="etiquette-de-champ-de-formulaire" w:history="1">
-        <w:r>
-          <w:rPr>
-            <w:rStyle w:val="Hyperlink"/>
-            <w:rFonts w:ascii="Times New Roman" w:eastAsia="Times New Roman" w:hAnsi="Times New Roman" w:cs="Times New Roman"/>
-            <w:kern w:val="0"/>
-            <w:szCs w:val="24"/>
-          </w:rPr>
-          <w:t>étiquette</w:t>
-        </w:r>
-      </w:hyperlink>
+      <w:r>
+        <w:rPr>
+          <w:rFonts w:ascii="Times New Roman" w:eastAsia="Times New Roman" w:hAnsi="Times New Roman" w:cs="Times New Roman"/>
+          <w:kern w:val="0"/>
+          <w:szCs w:val="24"/>
+        </w:rPr>
+        <w:t>étiquette</w:t>
+      </w:r>
       <w:r>
         <w:rPr>
           <w:rFonts w:ascii="Calibri" w:hAnsi="Calibri" w:cs="Calibri"/>
         </w:rPr>
         <w:t xml:space="preserve">, grouper </w:t>
       </w:r>
-      <w:hyperlink r:id="rId76" w:anchor="champs-de-meme-nature" w:history="1">
-        <w:r>
-          <w:rPr>
-            <w:rStyle w:val="Hyperlink"/>
-            <w:rFonts w:ascii="Times New Roman" w:eastAsia="Times New Roman" w:hAnsi="Times New Roman" w:cs="Times New Roman"/>
-            <w:kern w:val="0"/>
-            <w:szCs w:val="24"/>
-          </w:rPr>
-          <w:t xml:space="preserve">les champs </w:t>
-        </w:r>
-      </w:hyperlink>
-      <w:hyperlink r:id="rId77" w:anchor="champs-de-meme-nature" w:history="1">
-        <w:r>
-          <w:rPr>
-            <w:rStyle w:val="Hyperlink"/>
-            <w:rFonts w:ascii="Times New Roman" w:eastAsia="Times New Roman" w:hAnsi="Times New Roman" w:cs="Times New Roman"/>
-            <w:kern w:val="0"/>
-            <w:szCs w:val="24"/>
-          </w:rPr>
-          <w:t>de même nature</w:t>
-        </w:r>
-      </w:hyperlink>
+      <w:r>
+        <w:rPr>
+          <w:rFonts w:ascii="Times New Roman" w:eastAsia="Times New Roman" w:hAnsi="Times New Roman" w:cs="Times New Roman"/>
+          <w:kern w:val="0"/>
+          <w:szCs w:val="24"/>
+        </w:rPr>
+        <w:t>les champs de même nature</w:t>
+      </w:r>
       <w:r>
         <w:rPr>
           <w:rFonts w:ascii="Calibri" w:hAnsi="Calibri" w:cs="Calibri"/>
         </w:rPr>
         <w:t xml:space="preserve"> et leur donner une </w:t>
       </w:r>
-      <w:hyperlink r:id="rId78" w:anchor="legende" w:history="1">
-        <w:r>
-          <w:rPr>
-            <w:rStyle w:val="Hyperlink"/>
-            <w:rFonts w:ascii="Times New Roman" w:eastAsia="Times New Roman" w:hAnsi="Times New Roman" w:cs="Times New Roman"/>
-            <w:kern w:val="0"/>
-            <w:szCs w:val="24"/>
-          </w:rPr>
-          <w:t>légende</w:t>
-        </w:r>
-      </w:hyperlink>
+      <w:r>
+        <w:rPr>
+          <w:rFonts w:ascii="Times New Roman" w:eastAsia="Times New Roman" w:hAnsi="Times New Roman" w:cs="Times New Roman"/>
+          <w:kern w:val="0"/>
+          <w:szCs w:val="24"/>
+        </w:rPr>
+        <w:t>légende</w:t>
+      </w:r>
       <w:r>
         <w:rPr>
           <w:rFonts w:ascii="Calibri" w:hAnsi="Calibri" w:cs="Calibri"/>
@@ -1999,34 +1669,28 @@
         <w:lastRenderedPageBreak/>
         <w:t xml:space="preserve">pertinente, donner à chaque </w:t>
       </w:r>
-      <w:hyperlink r:id="rId79" w:anchor="bouton-formulaire" w:history="1">
-        <w:r>
-          <w:rPr>
-            <w:rStyle w:val="Hyperlink"/>
-            <w:rFonts w:ascii="Times New Roman" w:eastAsia="Times New Roman" w:hAnsi="Times New Roman" w:cs="Times New Roman"/>
-            <w:kern w:val="0"/>
-            <w:szCs w:val="24"/>
-          </w:rPr>
-          <w:t>bouton</w:t>
-        </w:r>
-      </w:hyperlink>
+      <w:r>
+        <w:rPr>
+          <w:rFonts w:ascii="Times New Roman" w:eastAsia="Times New Roman" w:hAnsi="Times New Roman" w:cs="Times New Roman"/>
+          <w:kern w:val="0"/>
+          <w:szCs w:val="24"/>
+        </w:rPr>
+        <w:t>bouton</w:t>
+      </w:r>
       <w:r>
         <w:rPr>
           <w:rFonts w:ascii="Calibri" w:hAnsi="Calibri" w:cs="Calibri"/>
         </w:rPr>
         <w:t xml:space="preserve"> un intitulé explicite. Vérifier la présence de suggestions lors des erreurs de saisie, s’assurer que le </w:t>
       </w:r>
-      <w:hyperlink r:id="rId80" w:anchor="controle-de-saisie-formulaire" w:history="1">
-        <w:r>
-          <w:rPr>
-            <w:rStyle w:val="Hyperlink"/>
-            <w:rFonts w:ascii="Times New Roman" w:eastAsia="Times New Roman" w:hAnsi="Times New Roman" w:cs="Times New Roman"/>
-            <w:kern w:val="0"/>
-            <w:szCs w:val="24"/>
-          </w:rPr>
-          <w:t>contrôle de saisie</w:t>
-        </w:r>
-      </w:hyperlink>
+      <w:r>
+        <w:rPr>
+          <w:rFonts w:ascii="Times New Roman" w:eastAsia="Times New Roman" w:hAnsi="Times New Roman" w:cs="Times New Roman"/>
+          <w:kern w:val="0"/>
+          <w:szCs w:val="24"/>
+        </w:rPr>
+        <w:t>contrôle de saisie</w:t>
+      </w:r>
       <w:r>
         <w:rPr>
           <w:rFonts w:ascii="Calibri" w:hAnsi="Calibri" w:cs="Calibri"/>
@@ -2083,120 +1747,96 @@
         </w:rPr>
         <w:t xml:space="preserve">Proposer au moins deux </w:t>
       </w:r>
-      <w:hyperlink r:id="rId81" w:anchor="systeme-de-navigation" w:history="1">
-        <w:r>
-          <w:rPr>
-            <w:rStyle w:val="Hyperlink"/>
-            <w:rFonts w:asciiTheme="minorHAnsi" w:hAnsiTheme="minorHAnsi" w:cstheme="minorHAnsi"/>
-          </w:rPr>
-          <w:t>systèmes de navigation</w:t>
-        </w:r>
-      </w:hyperlink>
+      <w:r>
+        <w:rPr>
+          <w:rFonts w:asciiTheme="minorHAnsi" w:hAnsiTheme="minorHAnsi" w:cstheme="minorHAnsi"/>
+        </w:rPr>
+        <w:t>systèmes de navigation</w:t>
+      </w:r>
       <w:r>
         <w:rPr>
           <w:rFonts w:asciiTheme="minorHAnsi" w:hAnsiTheme="minorHAnsi" w:cstheme="minorHAnsi"/>
         </w:rPr>
         <w:t xml:space="preserve"> différents dans un </w:t>
       </w:r>
-      <w:hyperlink r:id="rId82" w:anchor="ensemble-de-pages" w:history="1">
-        <w:r>
-          <w:rPr>
-            <w:rStyle w:val="Hyperlink"/>
-            <w:rFonts w:asciiTheme="minorHAnsi" w:hAnsiTheme="minorHAnsi" w:cstheme="minorHAnsi"/>
-          </w:rPr>
-          <w:t>ensemble de pages</w:t>
-        </w:r>
-      </w:hyperlink>
+      <w:r>
+        <w:rPr>
+          <w:rFonts w:asciiTheme="minorHAnsi" w:hAnsiTheme="minorHAnsi" w:cstheme="minorHAnsi"/>
+        </w:rPr>
+        <w:t>ensemble de pages</w:t>
+      </w:r>
       <w:r>
         <w:rPr>
           <w:rFonts w:asciiTheme="minorHAnsi" w:hAnsiTheme="minorHAnsi" w:cstheme="minorHAnsi"/>
         </w:rPr>
         <w:t xml:space="preserve"> (</w:t>
       </w:r>
-      <w:hyperlink r:id="rId83" w:anchor="menu-et-barre-de-navigation" w:history="1">
-        <w:r>
-          <w:rPr>
-            <w:rStyle w:val="Hyperlink"/>
-            <w:rFonts w:asciiTheme="minorHAnsi" w:hAnsiTheme="minorHAnsi" w:cstheme="minorHAnsi"/>
-          </w:rPr>
-          <w:t>menu de navigation</w:t>
-        </w:r>
-      </w:hyperlink>
+      <w:r>
+        <w:rPr>
+          <w:rFonts w:asciiTheme="minorHAnsi" w:hAnsiTheme="minorHAnsi" w:cstheme="minorHAnsi"/>
+        </w:rPr>
+        <w:t>menu de navigation</w:t>
+      </w:r>
       <w:r>
         <w:rPr>
           <w:rFonts w:asciiTheme="minorHAnsi" w:hAnsiTheme="minorHAnsi" w:cstheme="minorHAnsi"/>
         </w:rPr>
         <w:t xml:space="preserve">, </w:t>
       </w:r>
-      <w:hyperlink r:id="rId84" w:anchor="page-plan-du-site" w:history="1">
-        <w:r>
-          <w:rPr>
-            <w:rStyle w:val="Hyperlink"/>
-            <w:rFonts w:asciiTheme="minorHAnsi" w:hAnsiTheme="minorHAnsi" w:cstheme="minorHAnsi"/>
-          </w:rPr>
-          <w:t>plan du site</w:t>
-        </w:r>
-      </w:hyperlink>
+      <w:r>
+        <w:rPr>
+          <w:rFonts w:asciiTheme="minorHAnsi" w:hAnsiTheme="minorHAnsi" w:cstheme="minorHAnsi"/>
+        </w:rPr>
+        <w:t>plan du site</w:t>
+      </w:r>
       <w:r>
         <w:rPr>
           <w:rFonts w:asciiTheme="minorHAnsi" w:hAnsiTheme="minorHAnsi" w:cstheme="minorHAnsi"/>
         </w:rPr>
         <w:t xml:space="preserve"> ou </w:t>
       </w:r>
-      <w:hyperlink r:id="rId85" w:anchor="moteur-de-recherche-interne-a-un-site-web" w:history="1">
-        <w:r>
-          <w:rPr>
-            <w:rStyle w:val="Hyperlink"/>
-            <w:rFonts w:asciiTheme="minorHAnsi" w:hAnsiTheme="minorHAnsi" w:cstheme="minorHAnsi"/>
-          </w:rPr>
-          <w:t>moteur de recherche</w:t>
-        </w:r>
-      </w:hyperlink>
+      <w:r>
+        <w:rPr>
+          <w:rFonts w:asciiTheme="minorHAnsi" w:hAnsiTheme="minorHAnsi" w:cstheme="minorHAnsi"/>
+        </w:rPr>
+        <w:t>moteur de recherche</w:t>
+      </w:r>
       <w:r>
         <w:rPr>
           <w:rFonts w:asciiTheme="minorHAnsi" w:hAnsiTheme="minorHAnsi" w:cstheme="minorHAnsi"/>
         </w:rPr>
         <w:t xml:space="preserve">). Donner la possibilité d’éviter ou d’atteindre les principaux regroupements de contenus en particulier la zone de contenu principale via un </w:t>
       </w:r>
-      <w:hyperlink r:id="rId86" w:anchor="liens-d-evitement-ou-d-acces-rapide" w:history="1">
-        <w:r>
-          <w:rPr>
-            <w:rStyle w:val="Hyperlink"/>
-            <w:rFonts w:asciiTheme="minorHAnsi" w:hAnsiTheme="minorHAnsi" w:cstheme="minorHAnsi"/>
-          </w:rPr>
-          <w:t>lien d’évitement ou d’accès rapide</w:t>
-        </w:r>
-      </w:hyperlink>
+      <w:r>
+        <w:rPr>
+          <w:rFonts w:asciiTheme="minorHAnsi" w:hAnsiTheme="minorHAnsi" w:cstheme="minorHAnsi"/>
+        </w:rPr>
+        <w:t>lien d’évitement ou d’accès rapide</w:t>
+      </w:r>
       <w:r>
         <w:rPr>
           <w:rFonts w:asciiTheme="minorHAnsi" w:hAnsiTheme="minorHAnsi" w:cstheme="minorHAnsi"/>
         </w:rPr>
         <w:t>. S’assurer que l’</w:t>
       </w:r>
-      <w:hyperlink r:id="rId87" w:anchor="ordre-de-tabulation" w:history="1">
-        <w:r>
-          <w:rPr>
-            <w:rStyle w:val="Hyperlink"/>
-            <w:rFonts w:asciiTheme="minorHAnsi" w:hAnsiTheme="minorHAnsi" w:cstheme="minorHAnsi"/>
-          </w:rPr>
-          <w:t>ordre de tabulation</w:t>
-        </w:r>
-      </w:hyperlink>
+      <w:r>
+        <w:rPr>
+          <w:rFonts w:asciiTheme="minorHAnsi" w:hAnsiTheme="minorHAnsi" w:cstheme="minorHAnsi"/>
+        </w:rPr>
+        <w:t>ordre de tabulation</w:t>
+      </w:r>
       <w:r>
         <w:rPr>
           <w:rFonts w:asciiTheme="minorHAnsi" w:hAnsiTheme="minorHAnsi" w:cstheme="minorHAnsi"/>
         </w:rPr>
         <w:t xml:space="preserve"> est cohérent et que la page ne comporte pas de piège au clavier. S’assurer que les </w:t>
       </w:r>
-      <w:hyperlink r:id="rId88" w:anchor="raccourci-clavier" w:history="1">
-        <w:r>
-          <w:rPr>
-            <w:rStyle w:val="Hyperlink"/>
-            <w:rFonts w:asciiTheme="minorHAnsi" w:hAnsiTheme="minorHAnsi" w:cstheme="minorHAnsi"/>
-          </w:rPr>
-          <w:t>raccourcis clavier</w:t>
-        </w:r>
-      </w:hyperlink>
+      <w:r>
+        <w:rPr>
+          <w:rFonts w:asciiTheme="minorHAnsi" w:hAnsiTheme="minorHAnsi" w:cstheme="minorHAnsi"/>
+        </w:rPr>
+        <w:t>raccourcis clavier</w:t>
+      </w:r>
       <w:r>
         <w:rPr>
           <w:rFonts w:asciiTheme="minorHAnsi" w:hAnsiTheme="minorHAnsi" w:cstheme="minorHAnsi"/>
@@ -2217,10 +1857,10 @@
         <w:pStyle w:val="Heading2"/>
         <w:divId w:val="1256523850"/>
       </w:pPr>
-      <w:bookmarkStart w:id="15" w:name="__RefHeading__958_1454273984"/>
-      <w:bookmarkStart w:id="16" w:name="_Toc383062583"/>
+      <w:bookmarkStart w:id="14" w:name="__RefHeading__958_1454273984"/>
+      <w:bookmarkStart w:id="15" w:name="_Toc383062583"/>
+      <w:bookmarkEnd w:id="14"/>
       <w:bookmarkEnd w:id="15"/>
-      <w:bookmarkEnd w:id="16"/>
       <w:r>
         <w:t>Consultation</w:t>
       </w:r>
@@ -2247,111 +1887,60 @@
         </w:rPr>
         <w:t xml:space="preserve">S’assurer que l’utilisateur a le contrôle des actions imposées après un certain délai notamment les </w:t>
       </w:r>
-      <w:hyperlink r:id="rId89" w:anchor="procede-de-rafraichissement" w:history="1">
-        <w:r>
-          <w:rPr>
-            <w:rStyle w:val="Hyperlink"/>
-            <w:rFonts w:asciiTheme="minorHAnsi" w:hAnsiTheme="minorHAnsi" w:cstheme="minorHAnsi"/>
-          </w:rPr>
-          <w:t>procédés de rafraîchissement</w:t>
-        </w:r>
-      </w:hyperlink>
+      <w:r>
+        <w:rPr>
+          <w:rFonts w:asciiTheme="minorHAnsi" w:hAnsiTheme="minorHAnsi" w:cstheme="minorHAnsi"/>
+        </w:rPr>
+        <w:t>procédés de rafraîchissement</w:t>
+      </w:r>
       <w:r>
         <w:rPr>
           <w:rFonts w:asciiTheme="minorHAnsi" w:hAnsiTheme="minorHAnsi" w:cstheme="minorHAnsi"/>
         </w:rPr>
         <w:t xml:space="preserve">, Donner la possibilité de contrôler les </w:t>
       </w:r>
-      <w:hyperlink r:id="rId90" w:anchor="changement-brusque-de-luminosite-ou-effet-de-flash" w:history="1">
-        <w:r>
-          <w:rPr>
-            <w:rStyle w:val="Hyperlink"/>
-            <w:rFonts w:asciiTheme="minorHAnsi" w:hAnsiTheme="minorHAnsi" w:cstheme="minorHAnsi"/>
-          </w:rPr>
-          <w:t>changements brusques de luminosité</w:t>
-        </w:r>
-      </w:hyperlink>
+      <w:r>
+        <w:rPr>
+          <w:rFonts w:asciiTheme="minorHAnsi" w:hAnsiTheme="minorHAnsi" w:cstheme="minorHAnsi"/>
+        </w:rPr>
+        <w:t>changements brusques de luminosité</w:t>
+      </w:r>
       <w:r>
         <w:rPr>
           <w:rFonts w:asciiTheme="minorHAnsi" w:hAnsiTheme="minorHAnsi" w:cstheme="minorHAnsi"/>
         </w:rPr>
         <w:t xml:space="preserve">, les ouvertures de nouvelles fenêtres et les </w:t>
       </w:r>
-      <w:hyperlink r:id="rId91" w:anchor="controle-contenu-en-mouvement-ou-clignotant" w:history="1">
-        <w:r>
-          <w:rPr>
-            <w:rStyle w:val="Hyperlink"/>
-            <w:rFonts w:asciiTheme="minorHAnsi" w:hAnsiTheme="minorHAnsi" w:cstheme="minorHAnsi"/>
-          </w:rPr>
-          <w:t>contenus en mouvement ou clignotants</w:t>
-        </w:r>
-      </w:hyperlink>
+      <w:r>
+        <w:rPr>
+          <w:rFonts w:asciiTheme="minorHAnsi" w:hAnsiTheme="minorHAnsi" w:cstheme="minorHAnsi"/>
+        </w:rPr>
+        <w:t>contenus en mouvement ou clignotants</w:t>
+      </w:r>
       <w:r>
         <w:rPr>
           <w:rFonts w:asciiTheme="minorHAnsi" w:hAnsiTheme="minorHAnsi" w:cstheme="minorHAnsi"/>
         </w:rPr>
         <w:t xml:space="preserve">. S’assurer que les expressions inhabituelles et le jargon sont explicités. Proposer des </w:t>
       </w:r>
-      <w:hyperlink r:id="rId92" w:anchor="version-accessible-pour-un-document-en-telechargement" w:history="1">
-        <w:r>
-          <w:rPr>
-            <w:rStyle w:val="Hyperlink"/>
-            <w:rFonts w:asciiTheme="minorHAnsi" w:hAnsiTheme="minorHAnsi" w:cstheme="minorHAnsi"/>
-          </w:rPr>
-          <w:t xml:space="preserve">versions </w:t>
-        </w:r>
-      </w:hyperlink>
-      <w:hyperlink r:id="rId93" w:anchor="version-accessible-pour-un-document-en-telechargement" w:history="1">
-        <w:r>
-          <w:rPr>
-            <w:rStyle w:val="Hyperlink"/>
-            <w:rFonts w:asciiTheme="minorHAnsi" w:hAnsiTheme="minorHAnsi" w:cstheme="minorHAnsi"/>
-          </w:rPr>
-          <w:t>accessibles</w:t>
-        </w:r>
-      </w:hyperlink>
+      <w:r>
+        <w:rPr>
+          <w:rFonts w:asciiTheme="minorHAnsi" w:hAnsiTheme="minorHAnsi" w:cstheme="minorHAnsi"/>
+        </w:rPr>
+        <w:t>versions accessibles</w:t>
+      </w:r>
       <w:r>
         <w:rPr>
           <w:rFonts w:asciiTheme="minorHAnsi" w:hAnsiTheme="minorHAnsi" w:cstheme="minorHAnsi"/>
         </w:rPr>
         <w:t xml:space="preserve"> des documents en téléchargement ou les rendre accessibles. S’assurer que le contenu puisse être consulté quelque-soit l’orientation de l’écran et au moyen de </w:t>
       </w:r>
-      <w:hyperlink r:id="rId94" w:anchor="gestes-complexes-et-gestes-simples" w:history="1">
-        <w:r>
-          <w:rPr>
-            <w:rStyle w:val="Hyperlink"/>
-            <w:rFonts w:asciiTheme="minorHAnsi" w:hAnsiTheme="minorHAnsi" w:cstheme="minorHAnsi"/>
-          </w:rPr>
-          <w:t>g</w:t>
-        </w:r>
-      </w:hyperlink>
-      <w:hyperlink r:id="rId95" w:anchor="gestes-complexes-et-gestes-simples" w:history="1">
-        <w:r>
-          <w:rPr>
-            <w:rStyle w:val="Hyperlink"/>
-            <w:rFonts w:asciiTheme="minorHAnsi" w:hAnsiTheme="minorHAnsi" w:cstheme="minorHAnsi"/>
-          </w:rPr>
-          <w:t>este</w:t>
-        </w:r>
-      </w:hyperlink>
-      <w:hyperlink r:id="rId96" w:anchor="gestes-complexes-et-gestes-simples" w:history="1">
-        <w:r>
-          <w:rPr>
-            <w:rStyle w:val="Hyperlink"/>
-            <w:rFonts w:asciiTheme="minorHAnsi" w:hAnsiTheme="minorHAnsi" w:cstheme="minorHAnsi"/>
-          </w:rPr>
-          <w:t>s</w:t>
-        </w:r>
-      </w:hyperlink>
-      <w:hyperlink r:id="rId97" w:anchor="gestes-complexes-et-gestes-simples" w:history="1">
-        <w:r>
-          <w:rPr>
-            <w:rStyle w:val="Hyperlink"/>
-            <w:rFonts w:asciiTheme="minorHAnsi" w:hAnsiTheme="minorHAnsi" w:cstheme="minorHAnsi"/>
-          </w:rPr>
-          <w:t xml:space="preserve"> simples</w:t>
-        </w:r>
-      </w:hyperlink>
+      <w:r>
+        <w:rPr>
+          <w:rFonts w:asciiTheme="minorHAnsi" w:hAnsiTheme="minorHAnsi" w:cstheme="minorHAnsi"/>
+        </w:rPr>
+        <w:t>gestes simples</w:t>
+      </w:r>
       <w:r>
         <w:rPr>
           <w:rFonts w:asciiTheme="minorHAnsi" w:hAnsiTheme="minorHAnsi" w:cstheme="minorHAnsi"/>
@@ -2387,7 +1976,7 @@
 </file>
 
 <file path=word/numbering.xml><?xml version="1.0" encoding="utf-8"?>
-<w:numbering xmlns:wpc="http://schemas.microsoft.com/office/word/2010/wordprocessingCanvas" xmlns:cx="http://schemas.microsoft.com/office/drawing/2014/chartex" xmlns:cx1="http://schemas.microsoft.com/office/drawing/2015/9/8/chartex" xmlns:mc="http://schemas.openxmlformats.org/markup-compatibility/2006" xmlns:o="urn:schemas-microsoft-com:office:office" xmlns:r="http://schemas.openxmlformats.org/officeDocument/2006/relationships" xmlns:m="http://schemas.openxmlformats.org/officeDocument/2006/math" xmlns:v="urn:schemas-microsoft-com:vml" xmlns:wp14="http://schemas.microsoft.com/office/word/2010/wordprocessingDrawing" xmlns:wp="http://schemas.openxmlformats.org/drawingml/2006/wordprocessingDrawing" xmlns:w10="urn:schemas-microsoft-com:office:word" xmlns:w="http://schemas.openxmlformats.org/wordprocessingml/2006/main" xmlns:w14="http://schemas.microsoft.com/office/word/2010/wordml" xmlns:w15="http://schemas.microsoft.com/office/word/2012/wordml" xmlns:w16se="http://schemas.microsoft.com/office/word/2015/wordml/symex" xmlns:wpg="http://schemas.microsoft.com/office/word/2010/wordprocessingGroup" xmlns:wpi="http://schemas.microsoft.com/office/word/2010/wordprocessingInk" xmlns:wne="http://schemas.microsoft.com/office/word/2006/wordml" xmlns:wps="http://schemas.microsoft.com/office/word/2010/wordprocessingShape" mc:Ignorable="w14 w15 w16se wp14">
+<w:numbering xmlns:wpc="http://schemas.microsoft.com/office/word/2010/wordprocessingCanvas" xmlns:cx="http://schemas.microsoft.com/office/drawing/2014/chartex" xmlns:cx1="http://schemas.microsoft.com/office/drawing/2015/9/8/chartex" xmlns:cx2="http://schemas.microsoft.com/office/drawing/2015/10/21/chartex" xmlns:cx3="http://schemas.microsoft.com/office/drawing/2016/5/9/chartex" xmlns:cx4="http://schemas.microsoft.com/office/drawing/2016/5/10/chartex" xmlns:cx5="http://schemas.microsoft.com/office/drawing/2016/5/11/chartex" xmlns:cx6="http://schemas.microsoft.com/office/drawing/2016/5/12/chartex" xmlns:cx7="http://schemas.microsoft.com/office/drawing/2016/5/13/chartex" xmlns:cx8="http://schemas.microsoft.com/office/drawing/2016/5/14/chartex" xmlns:mc="http://schemas.openxmlformats.org/markup-compatibility/2006" xmlns:aink="http://schemas.microsoft.com/office/drawing/2016/ink" xmlns:am3d="http://schemas.microsoft.com/office/drawing/2017/model3d" xmlns:o="urn:schemas-microsoft-com:office:office" xmlns:oel="http://schemas.microsoft.com/office/2019/extlst" xmlns:r="http://schemas.openxmlformats.org/officeDocument/2006/relationships" xmlns:m="http://schemas.openxmlformats.org/officeDocument/2006/math" xmlns:v="urn:schemas-microsoft-com:vml" xmlns:wp14="http://schemas.microsoft.com/office/word/2010/wordprocessingDrawing" xmlns:wp="http://schemas.openxmlformats.org/drawingml/2006/wordprocessingDrawing" xmlns:w10="urn:schemas-microsoft-com:office:word" xmlns:w="http://schemas.openxmlformats.org/wordprocessingml/2006/main" xmlns:w14="http://schemas.microsoft.com/office/word/2010/wordml" xmlns:w15="http://schemas.microsoft.com/office/word/2012/wordml" xmlns:w16cex="http://schemas.microsoft.com/office/word/2018/wordml/cex" xmlns:w16cid="http://schemas.microsoft.com/office/word/2016/wordml/cid" xmlns:w16="http://schemas.microsoft.com/office/word/2018/wordml" xmlns:w16du="http://schemas.microsoft.com/office/word/2023/wordml/word16du" xmlns:w16sdtdh="http://schemas.microsoft.com/office/word/2020/wordml/sdtdatahash" xmlns:w16sdtfl="http://schemas.microsoft.com/office/word/2024/wordml/sdtformatlock" xmlns:w16se="http://schemas.microsoft.com/office/word/2015/wordml/symex" xmlns:wpg="http://schemas.microsoft.com/office/word/2010/wordprocessingGroup" xmlns:wpi="http://schemas.microsoft.com/office/word/2010/wordprocessingInk" xmlns:wne="http://schemas.microsoft.com/office/word/2006/wordml" xmlns:wps="http://schemas.microsoft.com/office/word/2010/wordprocessingShape" mc:Ignorable="w14 w15 w16se w16cid w16 w16cex w16sdtdh w16sdtfl w16du wp14">
   <w:abstractNum w:abstractNumId="0" w15:restartNumberingAfterBreak="0">
     <w:nsid w:val="084F7B77"/>
     <w:multiLevelType w:val="hybridMultilevel"/>
@@ -3657,38 +3246,38 @@
       </w:rPr>
     </w:lvl>
   </w:abstractNum>
-  <w:num w:numId="1">
+  <w:num w:numId="1" w16cid:durableId="84346803">
     <w:abstractNumId w:val="3"/>
   </w:num>
-  <w:num w:numId="2">
+  <w:num w:numId="2" w16cid:durableId="1244922379">
     <w:abstractNumId w:val="7"/>
   </w:num>
-  <w:num w:numId="3">
+  <w:num w:numId="3" w16cid:durableId="2031108183">
     <w:abstractNumId w:val="4"/>
   </w:num>
-  <w:num w:numId="4">
+  <w:num w:numId="4" w16cid:durableId="342165581">
     <w:abstractNumId w:val="5"/>
   </w:num>
-  <w:num w:numId="5">
+  <w:num w:numId="5" w16cid:durableId="1683507100">
     <w:abstractNumId w:val="6"/>
   </w:num>
-  <w:num w:numId="6">
+  <w:num w:numId="6" w16cid:durableId="1148400953">
     <w:abstractNumId w:val="1"/>
   </w:num>
-  <w:num w:numId="7">
+  <w:num w:numId="7" w16cid:durableId="528615383">
     <w:abstractNumId w:val="2"/>
   </w:num>
-  <w:num w:numId="8">
+  <w:num w:numId="8" w16cid:durableId="824786683">
     <w:abstractNumId w:val="0"/>
   </w:num>
-  <w:num w:numId="9">
+  <w:num w:numId="9" w16cid:durableId="1861892217">
     <w:abstractNumId w:val="8"/>
   </w:num>
 </w:numbering>
 </file>
 
 <file path=word/styles.xml><?xml version="1.0" encoding="utf-8"?>
-<w:styles xmlns:mc="http://schemas.openxmlformats.org/markup-compatibility/2006" xmlns:r="http://schemas.openxmlformats.org/officeDocument/2006/relationships" xmlns:w="http://schemas.openxmlformats.org/wordprocessingml/2006/main" xmlns:w14="http://schemas.microsoft.com/office/word/2010/wordml" xmlns:w15="http://schemas.microsoft.com/office/word/2012/wordml" xmlns:w16se="http://schemas.microsoft.com/office/word/2015/wordml/symex" mc:Ignorable="w14 w15 w16se">
+<w:styles xmlns:mc="http://schemas.openxmlformats.org/markup-compatibility/2006" xmlns:r="http://schemas.openxmlformats.org/officeDocument/2006/relationships" xmlns:w="http://schemas.openxmlformats.org/wordprocessingml/2006/main" xmlns:w14="http://schemas.microsoft.com/office/word/2010/wordml" xmlns:w15="http://schemas.microsoft.com/office/word/2012/wordml" xmlns:w16cex="http://schemas.microsoft.com/office/word/2018/wordml/cex" xmlns:w16cid="http://schemas.microsoft.com/office/word/2016/wordml/cid" xmlns:w16="http://schemas.microsoft.com/office/word/2018/wordml" xmlns:w16du="http://schemas.microsoft.com/office/word/2023/wordml/word16du" xmlns:w16sdtdh="http://schemas.microsoft.com/office/word/2020/wordml/sdtdatahash" xmlns:w16sdtfl="http://schemas.microsoft.com/office/word/2024/wordml/sdtformatlock" xmlns:w16se="http://schemas.microsoft.com/office/word/2015/wordml/symex" mc:Ignorable="w14 w15 w16se w16cid w16 w16cex w16sdtdh w16sdtfl w16du">
   <w:docDefaults>
     <w:rPrDefault>
       <w:rPr>
@@ -3698,7 +3287,7 @@
     </w:rPrDefault>
     <w:pPrDefault/>
   </w:docDefaults>
-  <w:latentStyles w:defLockedState="0" w:defUIPriority="99" w:defSemiHidden="0" w:defUnhideWhenUsed="0" w:defQFormat="0" w:count="371">
+  <w:latentStyles w:defLockedState="0" w:defUIPriority="99" w:defSemiHidden="0" w:defUnhideWhenUsed="0" w:defQFormat="0" w:count="376">
     <w:lsdException w:name="Normal" w:uiPriority="0" w:qFormat="1"/>
     <w:lsdException w:name="heading 1" w:uiPriority="9" w:qFormat="1"/>
     <w:lsdException w:name="heading 2" w:uiPriority="9" w:qFormat="1"/>
@@ -4070,6 +3659,11 @@
     <w:lsdException w:name="List Table 5 Dark Accent 6" w:uiPriority="50"/>
     <w:lsdException w:name="List Table 6 Colorful Accent 6" w:uiPriority="51"/>
     <w:lsdException w:name="List Table 7 Colorful Accent 6" w:uiPriority="52"/>
+    <w:lsdException w:name="Mention" w:semiHidden="1" w:unhideWhenUsed="1"/>
+    <w:lsdException w:name="Smart Hyperlink" w:semiHidden="1" w:unhideWhenUsed="1"/>
+    <w:lsdException w:name="Hashtag" w:semiHidden="1" w:unhideWhenUsed="1"/>
+    <w:lsdException w:name="Unresolved Mention" w:semiHidden="1" w:unhideWhenUsed="1"/>
+    <w:lsdException w:name="Smart Link" w:semiHidden="1" w:unhideWhenUsed="1"/>
   </w:latentStyles>
   <w:style w:type="paragraph" w:default="1" w:styleId="Normal">
     <w:name w:val="Normal"/>
@@ -4484,6 +4078,18 @@
       <w:rFonts w:eastAsia="Times New Roman"/>
     </w:rPr>
   </w:style>
+  <w:style w:type="character" w:styleId="UnresolvedMention">
+    <w:name w:val="Unresolved Mention"/>
+    <w:basedOn w:val="DefaultParagraphFont"/>
+    <w:uiPriority w:val="99"/>
+    <w:semiHidden/>
+    <w:unhideWhenUsed/>
+    <w:rsid w:val="00C821BA"/>
+    <w:rPr>
+      <w:color w:val="605E5C"/>
+      <w:shd w:val="clear" w:color="auto" w:fill="E1DFDD"/>
+    </w:rPr>
+  </w:style>
 </w:styles>
 </file>
 

</xml_diff>

<commit_message>
update simplified audit report
</commit_message>
<xml_diff>
--- a/src/files/fr/general/template-rapport-audit-simplifie.docx
+++ b/src/files/fr/general/template-rapport-audit-simplifie.docx
@@ -162,19 +162,7 @@
           <w:rPr>
             <w:rStyle w:val="Hyperlink"/>
           </w:rPr>
-          <w:t>Méthode de contrôle simplifiée de l’accessibi</w:t>
-        </w:r>
-        <w:r>
-          <w:rPr>
-            <w:rStyle w:val="Hyperlink"/>
-          </w:rPr>
-          <w:t>l</w:t>
-        </w:r>
-        <w:r>
-          <w:rPr>
-            <w:rStyle w:val="Hyperlink"/>
-          </w:rPr>
-          <w:t>ité pour le Luxembourg – v1</w:t>
+          <w:t>Méthode de contrôle simplifiée de l’accessibilité pour le Luxembourg – v1</w:t>
         </w:r>
         <w:r>
           <w:rPr>
@@ -219,7 +207,7 @@
         <w:spacing w:before="100" w:beforeAutospacing="1" w:after="100" w:afterAutospacing="1"/>
       </w:pPr>
       <w:r>
-        <w:t>Attention, l’audit effectué est un audit simplifié et non un audit de conformité (ou audit "complet"). Il a vocation à détecter une série de problèmes d’accessibilité mais n'est pas exhaustif. Le fait qu’aucun problème ne soit remonté pour un critère RGAA donné ne signifie pas qu’il n’y a pas de problème d’accessibilité pour ce critère. De même, lorsque nous rapportons une occurrence d’un problème, ce problème peut avoir d’autres occurrences. N’hésitez pas à vérifier de manière exhaustive l’accessibilité de votre site conformément au référentie</w:t>
+        <w:t>Attention, l’audit effectué est un audit simplifié et non un audit de conformité (ou audit "complet"). Il a vocation à détecter une série de problèmes d’accessibilité mais n'est pas exhaustif. Le fait qu’aucun problème ne soit remonté pour un critère donné ne signifie pas qu’il n’y a pas de problème d’accessibilité pour ce critère. De même, lorsque nous rapportons une occurrence d’un problème, ce problème peut avoir d’autres occurrences. N’hésitez pas à vérifier de manière exhaustive l’accessibilité de votre site conformément au référentie</w:t>
       </w:r>
       <w:r>
         <w:t>l RAWeb 1.1</w:t>

</xml_diff>